<commit_message>
vault backup: 2026-09-01 12:46:36
</commit_message>
<xml_diff>
--- a/POC-EuroCRM-Vault/outputs/EuroCRM_Solution_Overview_Document.docx
+++ b/POC-EuroCRM-Vault/outputs/EuroCRM_Solution_Overview_Document.docx
@@ -713,7 +713,7 @@
                 <w:noProof/>
                 <w:webHidden/>
               </w:rPr>
-              <w:t>10</w:t>
+              <w:t>11</w:t>
             </w:r>
             <w:r>
               <w:rPr>
@@ -993,7 +993,7 @@
                 <w:noProof/>
                 <w:webHidden/>
               </w:rPr>
-              <w:t>16</w:t>
+              <w:t>17</w:t>
             </w:r>
             <w:r>
               <w:rPr>
@@ -1063,7 +1063,7 @@
                 <w:noProof/>
                 <w:webHidden/>
               </w:rPr>
-              <w:t>16</w:t>
+              <w:t>17</w:t>
             </w:r>
             <w:r>
               <w:rPr>
@@ -1336,7 +1336,7 @@
                 <w:noProof/>
                 <w:webHidden/>
               </w:rPr>
-              <w:t>22</w:t>
+              <w:t>23</w:t>
             </w:r>
             <w:r>
               <w:rPr>
@@ -1546,7 +1546,7 @@
                 <w:noProof/>
                 <w:webHidden/>
               </w:rPr>
-              <w:t>28</w:t>
+              <w:t>29</w:t>
             </w:r>
             <w:r>
               <w:rPr>
@@ -3877,11 +3877,11 @@
         <w:tblLook w:val="0000" w:firstRow="0" w:lastRow="0" w:firstColumn="0" w:lastColumn="0" w:noHBand="0" w:noVBand="0"/>
       </w:tblPr>
       <w:tblGrid>
-        <w:gridCol w:w="2115"/>
-        <w:gridCol w:w="2497"/>
-        <w:gridCol w:w="2085"/>
-        <w:gridCol w:w="1069"/>
-        <w:gridCol w:w="1255"/>
+        <w:gridCol w:w="3861"/>
+        <w:gridCol w:w="1608"/>
+        <w:gridCol w:w="1261"/>
+        <w:gridCol w:w="1054"/>
+        <w:gridCol w:w="1237"/>
       </w:tblGrid>
       <w:tr>
         <w:tblPrEx>
@@ -3994,7 +3994,7 @@
           </w:tcPr>
           <w:p>
             <w:r>
-              <w:t>Gary Newport</w:t>
+              <w:t>Gary Newport (Gary.newport@knightfrank.com)</w:t>
             </w:r>
           </w:p>
         </w:tc>
@@ -4014,6 +4014,64 @@
           </w:tcPr>
           <w:p>
             <w:r>
+              <w:t>Enterprise</w:t>
+            </w:r>
+          </w:p>
+        </w:tc>
+        <w:tc>
+          <w:tcPr>
+            <w:tcW w:w="0" w:type="auto"/>
+          </w:tcPr>
+          <w:p>
+            <w:r>
+              <w:t>High</w:t>
+            </w:r>
+          </w:p>
+        </w:tc>
+        <w:tc>
+          <w:tcPr>
+            <w:tcW w:w="0" w:type="auto"/>
+          </w:tcPr>
+          <w:p>
+            <w:r>
+              <w:t>High</w:t>
+            </w:r>
+          </w:p>
+        </w:tc>
+      </w:tr>
+      <w:tr>
+        <w:tblPrEx>
+          <w:tblCellMar>
+            <w:top w:w="0" w:type="dxa"/>
+            <w:bottom w:w="0" w:type="dxa"/>
+          </w:tblCellMar>
+        </w:tblPrEx>
+        <w:tc>
+          <w:tcPr>
+            <w:tcW w:w="0" w:type="auto"/>
+          </w:tcPr>
+          <w:p>
+            <w:r>
+              <w:t>Hannah Nguyen (Hannah.Nguyen@knightfrank.com)</w:t>
+            </w:r>
+          </w:p>
+        </w:tc>
+        <w:tc>
+          <w:tcPr>
+            <w:tcW w:w="0" w:type="auto"/>
+          </w:tcPr>
+          <w:p>
+            <w:r>
+              <w:t>Business Analyst</w:t>
+            </w:r>
+          </w:p>
+        </w:tc>
+        <w:tc>
+          <w:tcPr>
+            <w:tcW w:w="0" w:type="auto"/>
+          </w:tcPr>
+          <w:p>
+            <w:r>
               <w:t>Europe</w:t>
             </w:r>
           </w:p>
@@ -4110,7 +4168,7 @@
           </w:tcPr>
           <w:p>
             <w:r>
-              <w:t>CTO</w:t>
+              <w:t>Nick Wadge (nick.wadge@knightfrank.com)</w:t>
             </w:r>
           </w:p>
         </w:tc>
@@ -4168,7 +4226,7 @@
           </w:tcPr>
           <w:p>
             <w:r>
-              <w:t>European MDs</w:t>
+              <w:t>Marco Capelli (Marco.Capelli@knightfrank.com)</w:t>
             </w:r>
           </w:p>
         </w:tc>
@@ -4284,6 +4342,7 @@
           </w:tcPr>
           <w:p>
             <w:r>
+              <w:lastRenderedPageBreak/>
               <w:t>Legal/Compliance</w:t>
             </w:r>
           </w:p>
@@ -4506,7 +4565,6 @@
     </w:tbl>
     <w:p>
       <w:r>
-        <w:lastRenderedPageBreak/>
         <w:t>The full RACI matrix is maintained in the wiki (key-stakeholders).</w:t>
       </w:r>
     </w:p>
@@ -4742,6 +4800,7 @@
         <w:rPr>
           <w:b/>
         </w:rPr>
+        <w:lastRenderedPageBreak/>
         <w:t>Regulatory Gates</w:t>
       </w:r>
       <w:r>
@@ -4856,7 +4915,6 @@
         <w:rPr>
           <w:b/>
         </w:rPr>
-        <w:lastRenderedPageBreak/>
         <w:t>Audit Export</w:t>
       </w:r>
       <w:r>
@@ -5345,6 +5403,7 @@
         <w:jc w:val="both"/>
       </w:pPr>
       <w:r>
+        <w:lastRenderedPageBreak/>
         <w:t>KPIs and Success</w:t>
       </w:r>
       <w:bookmarkEnd w:id="11"/>
@@ -5666,7 +5725,6 @@
           </w:tcPr>
           <w:p>
             <w:r>
-              <w:lastRenderedPageBreak/>
               <w:t>Industry classification accuracy</w:t>
             </w:r>
           </w:p>
@@ -6329,6 +6387,7 @@
           </w:tcPr>
           <w:p>
             <w:r>
+              <w:lastRenderedPageBreak/>
               <w:t>Document retrieval time</w:t>
             </w:r>
           </w:p>
@@ -6631,7 +6690,6 @@
           </w:tcPr>
           <w:p>
             <w:r>
-              <w:lastRenderedPageBreak/>
               <w:t>Fee collection rate</w:t>
             </w:r>
           </w:p>
@@ -7184,6 +7242,7 @@
         <w:rPr>
           <w:b/>
         </w:rPr>
+        <w:lastRenderedPageBreak/>
         <w:t>Phase 1:</w:t>
       </w:r>
       <w:r>
@@ -7211,7 +7270,6 @@
         <w:jc w:val="both"/>
       </w:pPr>
       <w:r>
-        <w:lastRenderedPageBreak/>
         <w:t>Solution Scope</w:t>
       </w:r>
       <w:bookmarkEnd w:id="13"/>
@@ -7562,6 +7620,7 @@
           </w:tcPr>
           <w:p>
             <w:r>
+              <w:lastRenderedPageBreak/>
               <w:t>kf_Property</w:t>
             </w:r>
           </w:p>
@@ -7752,7 +7811,6 @@
           </w:tcPr>
           <w:p>
             <w:r>
-              <w:lastRenderedPageBreak/>
               <w:t>kf_Deal</w:t>
             </w:r>
           </w:p>
@@ -8388,6 +8446,7 @@
         <w:pStyle w:val="ListBullet"/>
       </w:pPr>
       <w:r>
+        <w:lastRenderedPageBreak/>
         <w:t>WIP tracking with % complete</w:t>
       </w:r>
     </w:p>
@@ -8444,7 +8503,6 @@
         <w:pStyle w:val="ListBullet"/>
       </w:pPr>
       <w:r>
-        <w:lastRenderedPageBreak/>
         <w:t>Cross-border portfolio management</w:t>
       </w:r>
     </w:p>
@@ -8869,6 +8927,7 @@
         <w:pStyle w:val="ListBullet"/>
       </w:pPr>
       <w:r>
+        <w:lastRenderedPageBreak/>
         <w:t>Custom development beyond platform capabilities</w:t>
       </w:r>
     </w:p>
@@ -8909,7 +8968,6 @@
         <w:pStyle w:val="Heading3"/>
       </w:pPr>
       <w:r>
-        <w:lastRenderedPageBreak/>
         <w:t>Integrations and data</w:t>
       </w:r>
     </w:p>
@@ -9380,6 +9438,7 @@
         <w:jc w:val="both"/>
       </w:pPr>
       <w:r>
+        <w:lastRenderedPageBreak/>
         <w:t>Solution Architecture</w:t>
       </w:r>
       <w:bookmarkEnd w:id="19"/>
@@ -9427,7 +9486,6 @@
         <w:rPr>
           <w:b/>
         </w:rPr>
-        <w:lastRenderedPageBreak/>
         <w:t>Layered Solution Model</w:t>
       </w:r>
       <w:r>
@@ -9591,6 +9649,7 @@
         <w:pStyle w:val="Heading3"/>
       </w:pPr>
       <w:r>
+        <w:lastRenderedPageBreak/>
         <w:t>Integration components</w:t>
       </w:r>
     </w:p>
@@ -9764,7 +9823,6 @@
           </w:tcPr>
           <w:p>
             <w:r>
-              <w:lastRenderedPageBreak/>
               <w:t>Power Automate</w:t>
             </w:r>
           </w:p>
@@ -10072,6 +10130,7 @@
         <w:pStyle w:val="ListBullet"/>
       </w:pPr>
       <w:r>
+        <w:lastRenderedPageBreak/>
         <w:t>S1 Origination to S2 Pitch and Mandate to S3 Instruction to S4 Marketing to S5 Bidding to S6 Exclusivity to S7 Due Diligence to S8 Completion</w:t>
       </w:r>
     </w:p>
@@ -10104,7 +10163,6 @@
         <w:pStyle w:val="ListBullet"/>
       </w:pPr>
       <w:r>
-        <w:lastRenderedPageBreak/>
         <w:t>S7: City pre-emption (France), Notarial process (France), Right of refusal (Spain), Pre-emption delegation (EIT)</w:t>
       </w:r>
     </w:p>
@@ -10709,6 +10767,7 @@
           </w:tcPr>
           <w:p>
             <w:r>
+              <w:lastRenderedPageBreak/>
               <w:t>Investor Advisory</w:t>
             </w:r>
           </w:p>
@@ -10805,7 +10864,6 @@
           </w:tcPr>
           <w:p>
             <w:r>
-              <w:lastRenderedPageBreak/>
               <w:t>Leasing</w:t>
             </w:r>
           </w:p>
@@ -11151,6 +11209,7 @@
           </w:tcPr>
           <w:p>
             <w:r>
+              <w:lastRenderedPageBreak/>
               <w:t>KF Residential (Future)</w:t>
             </w:r>
           </w:p>
@@ -11220,7 +11279,6 @@
         <w:pStyle w:val="Heading3"/>
       </w:pPr>
       <w:r>
-        <w:lastRenderedPageBreak/>
         <w:t>Business process flows</w:t>
       </w:r>
     </w:p>
@@ -11826,6 +11884,7 @@
           </w:tcPr>
           <w:p>
             <w:r>
+              <w:lastRenderedPageBreak/>
               <w:t>Flow 7</w:t>
             </w:r>
           </w:p>
@@ -11933,7 +11992,6 @@
         <w:pStyle w:val="Heading3"/>
       </w:pPr>
       <w:r>
-        <w:lastRenderedPageBreak/>
         <w:t>Security architecture</w:t>
       </w:r>
     </w:p>
@@ -12565,6 +12623,7 @@
         <w:jc w:val="both"/>
       </w:pPr>
       <w:r>
+        <w:lastRenderedPageBreak/>
         <w:t>Data Architecture</w:t>
       </w:r>
       <w:bookmarkEnd w:id="29"/>
@@ -12610,7 +12669,6 @@
         <w:rPr>
           <w:lang w:val="en-US"/>
         </w:rPr>
-        <w:lastRenderedPageBreak/>
         <w:t>Client domain</w:t>
       </w:r>
     </w:p>
@@ -13097,6 +13155,7 @@
         <w:rPr>
           <w:lang w:val="en-US"/>
         </w:rPr>
+        <w:lastRenderedPageBreak/>
         <w:t>Finance domain</w:t>
       </w:r>
     </w:p>
@@ -13209,7 +13268,6 @@
         <w:rPr>
           <w:lang w:val="en-US"/>
         </w:rPr>
-        <w:lastRenderedPageBreak/>
         <w:t>Supporting domain</w:t>
       </w:r>
     </w:p>
@@ -13661,6 +13719,7 @@
               <w:rPr>
                 <w:lang w:val="en-US"/>
               </w:rPr>
+              <w:lastRenderedPageBreak/>
               <w:t>Poland</w:t>
             </w:r>
           </w:p>
@@ -13892,7 +13951,6 @@
               <w:rPr>
                 <w:lang w:val="en-US"/>
               </w:rPr>
-              <w:lastRenderedPageBreak/>
               <w:t>Future tables (Phase 3-4)</w:t>
             </w:r>
           </w:p>
@@ -14464,6 +14522,7 @@
           </w:tcPr>
           <w:p>
             <w:r>
+              <w:lastRenderedPageBreak/>
               <w:t>App Framework</w:t>
             </w:r>
           </w:p>
@@ -14578,7 +14637,6 @@
           </w:tcPr>
           <w:p>
             <w:r>
-              <w:lastRenderedPageBreak/>
               <w:t>AI</w:t>
             </w:r>
           </w:p>
@@ -15008,6 +15066,7 @@
         <w:pStyle w:val="ListBullet"/>
       </w:pPr>
       <w:r>
+        <w:lastRenderedPageBreak/>
         <w:t>Daily automated backups</w:t>
       </w:r>
     </w:p>
@@ -15064,7 +15123,6 @@
         <w:pStyle w:val="ListBullet"/>
       </w:pPr>
       <w:r>
-        <w:lastRenderedPageBreak/>
         <w:t>kf_IntegrationLog for CRM-specific integration tracking</w:t>
       </w:r>
     </w:p>
@@ -15543,6 +15601,7 @@
           </w:tcPr>
           <w:p>
             <w:r>
+              <w:lastRenderedPageBreak/>
               <w:t>Data residency</w:t>
             </w:r>
           </w:p>
@@ -15657,7 +15716,6 @@
           </w:tcPr>
           <w:p>
             <w:r>
-              <w:lastRenderedPageBreak/>
               <w:t>Modularity</w:t>
             </w:r>
           </w:p>
@@ -16170,6 +16228,7 @@
       <w:bookmarkStart w:id="37" w:name="_Toc195195041"/>
       <w:bookmarkStart w:id="38" w:name="_Toc195797108"/>
       <w:r>
+        <w:lastRenderedPageBreak/>
         <w:t>Target State Alignment</w:t>
       </w:r>
       <w:bookmarkEnd w:id="37"/>
@@ -16312,7 +16371,6 @@
           </w:tcPr>
           <w:p>
             <w:r>
-              <w:lastRenderedPageBreak/>
               <w:t>Enterprise data residency standards</w:t>
             </w:r>
           </w:p>
@@ -16900,6 +16958,7 @@
         <w:pStyle w:val="ListBullet"/>
       </w:pPr>
       <w:r>
+        <w:lastRenderedPageBreak/>
         <w:t>Existing system integrations must be maintained</w:t>
       </w:r>
     </w:p>
@@ -16918,7 +16977,6 @@
         <w:jc w:val="both"/>
       </w:pPr>
       <w:r>
-        <w:lastRenderedPageBreak/>
         <w:t>Key Functional and Non-Functional Requirements</w:t>
       </w:r>
       <w:bookmarkEnd w:id="41"/>
@@ -17136,6 +17194,7 @@
         <w:pStyle w:val="Heading3"/>
       </w:pPr>
       <w:r>
+        <w:lastRenderedPageBreak/>
         <w:t>Compliance</w:t>
       </w:r>
     </w:p>
@@ -17160,7 +17219,6 @@
         <w:pStyle w:val="ListBullet"/>
       </w:pPr>
       <w:r>
-        <w:lastRenderedPageBreak/>
         <w:t>Data retention policies: TBD</w:t>
       </w:r>
     </w:p>
@@ -17405,11 +17463,11 @@
           </w:tcPr>
           <w:p>
             <w:r>
-              <w:t xml:space="preserve">No institutionalised client knowledge - knowledge sits with individuals in Excel trackers, </w:t>
+              <w:t xml:space="preserve">No institutionalised client knowledge - knowledge sits with </w:t>
             </w:r>
             <w:r>
               <w:lastRenderedPageBreak/>
-              <w:t>mailboxes, and black books</w:t>
+              <w:t>individuals in Excel trackers, mailboxes, and black books</w:t>
             </w:r>
           </w:p>
         </w:tc>
@@ -17440,16 +17498,21 @@
           </w:tcPr>
           <w:p>
             <w:r>
-              <w:t>Centralise fragmented data into a common client/contact/property foundation</w:t>
-            </w:r>
-          </w:p>
-        </w:tc>
-        <w:tc>
-          <w:tcPr>
-            <w:tcW w:w="0" w:type="auto"/>
-          </w:tcPr>
-          <w:p>
-            <w:r>
+              <w:t>Centralise fragmented data into a common client/contact/</w:t>
+            </w:r>
+            <w:r>
+              <w:lastRenderedPageBreak/>
+              <w:t>property foundation</w:t>
+            </w:r>
+          </w:p>
+        </w:tc>
+        <w:tc>
+          <w:tcPr>
+            <w:tcW w:w="0" w:type="auto"/>
+          </w:tcPr>
+          <w:p>
+            <w:r>
+              <w:lastRenderedPageBreak/>
               <w:t>TBD</w:t>
             </w:r>
           </w:p>
@@ -22249,7 +22312,7 @@
   <w:abstractNum w:abstractNumId="0" w15:restartNumberingAfterBreak="0">
     <w:nsid w:val="FFFFFF89"/>
     <w:multiLevelType w:val="singleLevel"/>
-    <w:tmpl w:val="18DE4C78"/>
+    <w:tmpl w:val="56EAB6E8"/>
     <w:lvl w:ilvl="0">
       <w:start w:val="1"/>
       <w:numFmt w:val="bullet"/>
@@ -22267,7 +22330,7 @@
       </w:rPr>
     </w:lvl>
   </w:abstractNum>
-  <w:num w:numId="1" w16cid:durableId="914893893">
+  <w:num w:numId="1" w16cid:durableId="380400111">
     <w:abstractNumId w:val="0"/>
   </w:num>
 </w:numbering>
@@ -23384,7 +23447,7 @@
     <w:basedOn w:val="Normal"/>
     <w:uiPriority w:val="99"/>
     <w:unhideWhenUsed/>
-    <w:rsid w:val="001F6C65"/>
+    <w:rsid w:val="007C3030"/>
     <w:pPr>
       <w:numPr>
         <w:numId w:val="1"/>

</xml_diff>

<commit_message>
sod: source headings from wiki notes, dedupe section/file headings
</commit_message>
<xml_diff>
--- a/POC-EuroCRM-Vault/outputs/EuroCRM_Solution_Overview_Document.docx
+++ b/POC-EuroCRM-Vault/outputs/EuroCRM_Solution_Overview_Document.docx
@@ -3117,22 +3117,6 @@
       </w:r>
     </w:p>
     <w:p>
-      <w:pPr>
-        <w:pStyle w:val="Heading2"/>
-      </w:pPr>
-      <w:r>
-        <w:t>Business Context</w:t>
-      </w:r>
-    </w:p>
-    <w:p>
-      <w:pPr>
-        <w:pStyle w:val="Heading2"/>
-      </w:pPr>
-      <w:r>
-        <w:t>Business Context</w:t>
-      </w:r>
-    </w:p>
-    <w:p>
       <w:r>
         <w:t>Status: Draft Parent: solution overview Source: European CRM Architecture Review 2.pdf</w:t>
       </w:r>
@@ -3663,7 +3647,12 @@
         <w:pStyle w:val="Heading2"/>
       </w:pPr>
       <w:r>
-        <w:t>Problem Statement</w:t>
+        <w:t>Why We're Here — Problem Statement</w:t>
+      </w:r>
+    </w:p>
+    <w:p>
+      <w:r>
+        <w:t>Status: Draft Parent: solution overview Source: European CRM Architecture Review 2.pdf</w:t>
       </w:r>
     </w:p>
     <w:p>
@@ -3671,12 +3660,46 @@
         <w:pStyle w:val="Heading2"/>
       </w:pPr>
       <w:r>
-        <w:t>Why We're Here — Problem Statement</w:t>
-      </w:r>
-    </w:p>
-    <w:p>
-      <w:r>
-        <w:t>Status: Draft Parent: solution overview Source: European CRM Architecture Review 2.pdf</w:t>
+        <w:t>Core Problems</w:t>
+      </w:r>
+    </w:p>
+    <w:p>
+      <w:pPr>
+        <w:pStyle w:val="Heading3"/>
+      </w:pPr>
+      <w:r>
+        <w:t>1. Fragmented Client Intelligence</w:t>
+      </w:r>
+    </w:p>
+    <w:p>
+      <w:r>
+        <w:t>Client knowledge sits with individual brokers in email, Excel trackers, and shared folders. If a broker in Madrid is tracking an investor whose strategy matches a Paris asset, neither side knows. That connection only emerges by chance, if it emerges at all.</w:t>
+      </w:r>
+    </w:p>
+    <w:p>
+      <w:pPr>
+        <w:pStyle w:val="Heading3"/>
+      </w:pPr>
+      <w:r>
+        <w:t>2. Manual Reporting</w:t>
+      </w:r>
+    </w:p>
+    <w:p>
+      <w:r>
+        <w:t>Transaction reports are built manually in Excel. Price, buyer, seller, asset, and fee data assembled manually after every close. As deal volume grows, reporting burden grows with it.</w:t>
+      </w:r>
+    </w:p>
+    <w:p>
+      <w:pPr>
+        <w:pStyle w:val="Heading3"/>
+      </w:pPr>
+      <w:r>
+        <w:t>3. Missing Cross-Sell Opportunities</w:t>
+      </w:r>
+    </w:p>
+    <w:p>
+      <w:r>
+        <w:t>Fragmented data means opportunities for cross-border and cross-service-line collaboration are lost.</w:t>
       </w:r>
     </w:p>
     <w:p>
@@ -3684,53 +3707,6 @@
         <w:pStyle w:val="Heading2"/>
       </w:pPr>
       <w:r>
-        <w:t>Core Problems</w:t>
-      </w:r>
-    </w:p>
-    <w:p>
-      <w:pPr>
-        <w:pStyle w:val="Heading3"/>
-      </w:pPr>
-      <w:r>
-        <w:t>1. Fragmented Client Intelligence</w:t>
-      </w:r>
-    </w:p>
-    <w:p>
-      <w:r>
-        <w:t>Client knowledge sits with individual brokers in email, Excel trackers, and shared folders. If a broker in Madrid is tracking an investor whose strategy matches a Paris asset, neither side knows. That connection only emerges by chance, if it emerges at all.</w:t>
-      </w:r>
-    </w:p>
-    <w:p>
-      <w:pPr>
-        <w:pStyle w:val="Heading3"/>
-      </w:pPr>
-      <w:r>
-        <w:t>2. Manual Reporting</w:t>
-      </w:r>
-    </w:p>
-    <w:p>
-      <w:r>
-        <w:t>Transaction reports are built manually in Excel. Price, buyer, seller, asset, and fee data assembled manually after every close. As deal volume grows, reporting burden grows with it.</w:t>
-      </w:r>
-    </w:p>
-    <w:p>
-      <w:pPr>
-        <w:pStyle w:val="Heading3"/>
-      </w:pPr>
-      <w:r>
-        <w:t>3. Missing Cross-Sell Opportunities</w:t>
-      </w:r>
-    </w:p>
-    <w:p>
-      <w:r>
-        <w:t>Fragmented data means opportunities for cross-border and cross-service-line collaboration are lost.</w:t>
-      </w:r>
-    </w:p>
-    <w:p>
-      <w:pPr>
-        <w:pStyle w:val="Heading2"/>
-      </w:pPr>
-      <w:r>
         <w:t>Impact</w:t>
       </w:r>
     </w:p>
@@ -3775,22 +3751,6 @@
     <w:p>
       <w:pPr>
         <w:pStyle w:val="Heading1"/>
-      </w:pPr>
-      <w:r>
-        <w:t>Business Goals and Objectives</w:t>
-      </w:r>
-    </w:p>
-    <w:p>
-      <w:pPr>
-        <w:pStyle w:val="Heading2"/>
-      </w:pPr>
-      <w:r>
-        <w:t>Business Goals</w:t>
-      </w:r>
-    </w:p>
-    <w:p>
-      <w:pPr>
-        <w:pStyle w:val="Heading2"/>
       </w:pPr>
       <w:r>
         <w:t>Business Goals and Objectives</w:t>
@@ -4150,22 +4110,6 @@
     <w:p>
       <w:pPr>
         <w:pStyle w:val="Heading1"/>
-      </w:pPr>
-      <w:r>
-        <w:t>Key Stakeholders</w:t>
-      </w:r>
-    </w:p>
-    <w:p>
-      <w:pPr>
-        <w:pStyle w:val="Heading2"/>
-      </w:pPr>
-      <w:r>
-        <w:t>Key Stakeholders</w:t>
-      </w:r>
-    </w:p>
-    <w:p>
-      <w:pPr>
-        <w:pStyle w:val="Heading2"/>
       </w:pPr>
       <w:r>
         <w:t>Key Stakeholders</w:t>
@@ -6512,22 +6456,6 @@
     <w:p>
       <w:pPr>
         <w:pStyle w:val="Heading1"/>
-      </w:pPr>
-      <w:r>
-        <w:t>Business Capabilities</w:t>
-      </w:r>
-    </w:p>
-    <w:p>
-      <w:pPr>
-        <w:pStyle w:val="Heading2"/>
-      </w:pPr>
-      <w:r>
-        <w:t>Business Capabilities</w:t>
-      </w:r>
-    </w:p>
-    <w:p>
-      <w:pPr>
-        <w:pStyle w:val="Heading2"/>
       </w:pPr>
       <w:r>
         <w:t>Business Capabilities</w:t>
@@ -7666,14 +7594,6 @@
         <w:pStyle w:val="Heading2"/>
       </w:pPr>
       <w:r>
-        <w:t>Kpis And Success</w:t>
-      </w:r>
-    </w:p>
-    <w:p>
-      <w:pPr>
-        <w:pStyle w:val="Heading2"/>
-      </w:pPr>
-      <w:r>
         <w:t>KPIs and Success Metrics</w:t>
       </w:r>
     </w:p>
@@ -9655,14 +9575,6 @@
         <w:pStyle w:val="Heading2"/>
       </w:pPr>
       <w:r>
-        <w:t>Solution Scope In Scope</w:t>
-      </w:r>
-    </w:p>
-    <w:p>
-      <w:pPr>
-        <w:pStyle w:val="Heading2"/>
-      </w:pPr>
-      <w:r>
         <w:t>Solution Scope — In-Scope</w:t>
       </w:r>
     </w:p>
@@ -11685,14 +11597,6 @@
         <w:pStyle w:val="Heading2"/>
       </w:pPr>
       <w:r>
-        <w:t>Solution Scope Out Of Scope</w:t>
-      </w:r>
-    </w:p>
-    <w:p>
-      <w:pPr>
-        <w:pStyle w:val="Heading2"/>
-      </w:pPr>
-      <w:r>
         <w:t>Solution Scope — Out-of-Scope</w:t>
       </w:r>
     </w:p>
@@ -12508,7 +12412,12 @@
         <w:pStyle w:val="Heading2"/>
       </w:pPr>
       <w:r>
-        <w:t>Crm Lite Mvp Scope</w:t>
+        <w:t>CRM Lite — MVP Scope</w:t>
+      </w:r>
+    </w:p>
+    <w:p>
+      <w:r>
+        <w:t>Status: Draft Parent: solution overview Source: European CRM Architecture Review 2.pdf</w:t>
       </w:r>
     </w:p>
     <w:p>
@@ -12516,12 +12425,12 @@
         <w:pStyle w:val="Heading2"/>
       </w:pPr>
       <w:r>
-        <w:t>CRM Lite — MVP Scope</w:t>
-      </w:r>
-    </w:p>
-    <w:p>
-      <w:r>
-        <w:t>Status: Draft Parent: solution overview Source: European CRM Architecture Review 2.pdf</w:t>
+        <w:t>Key Principle</w:t>
+      </w:r>
+    </w:p>
+    <w:p>
+      <w:r>
+        <w:t>"The MVP is a shared client, contact, property and engagement foundation: a relationship and intelligence layer; not a full operational workflow system — which belongs to the Service Line deep build phase. Capital Markets is the first deeper workflow built on top."</w:t>
       </w:r>
     </w:p>
     <w:p>
@@ -12529,12 +12438,116 @@
         <w:pStyle w:val="Heading2"/>
       </w:pPr>
       <w:r>
-        <w:t>Key Principle</w:t>
-      </w:r>
-    </w:p>
-    <w:p>
-      <w:r>
-        <w:t>"The MVP is a shared client, contact, property and engagement foundation: a relationship and intelligence layer; not a full operational workflow system — which belongs to the Service Line deep build phase. Capital Markets is the first deeper workflow built on top."</w:t>
+        <w:t>Shared Foundation</w:t>
+      </w:r>
+    </w:p>
+    <w:p>
+      <w:r>
+        <w:t>Designed to be reusable across service lines and countries:</w:t>
+      </w:r>
+    </w:p>
+    <w:p>
+      <w:pPr>
+        <w:pStyle w:val="ListParagraph"/>
+      </w:pPr>
+      <w:r>
+        <w:t xml:space="preserve">• </w:t>
+      </w:r>
+      <w:r>
+        <w:t>Accounts; Contacts; Properties; Engagement Tracking; Security</w:t>
+      </w:r>
+    </w:p>
+    <w:p>
+      <w:pPr>
+        <w:pStyle w:val="ListParagraph"/>
+      </w:pPr>
+      <w:r>
+        <w:t xml:space="preserve">• </w:t>
+      </w:r>
+      <w:r>
+        <w:t>Single Client Record</w:t>
+      </w:r>
+    </w:p>
+    <w:p>
+      <w:pPr>
+        <w:pStyle w:val="ListParagraph"/>
+      </w:pPr>
+      <w:r>
+        <w:t xml:space="preserve">• </w:t>
+      </w:r>
+      <w:r>
+        <w:t>Cross-SL Contact Intelligence</w:t>
+      </w:r>
+    </w:p>
+    <w:p>
+      <w:pPr>
+        <w:pStyle w:val="ListParagraph"/>
+      </w:pPr>
+      <w:r>
+        <w:t xml:space="preserve">• </w:t>
+      </w:r>
+      <w:r>
+        <w:t>Shared Property Records</w:t>
+      </w:r>
+    </w:p>
+    <w:p>
+      <w:pPr>
+        <w:pStyle w:val="ListParagraph"/>
+      </w:pPr>
+      <w:r>
+        <w:t xml:space="preserve">• </w:t>
+      </w:r>
+      <w:r>
+        <w:t>Outlook Integration</w:t>
+      </w:r>
+    </w:p>
+    <w:p>
+      <w:pPr>
+        <w:pStyle w:val="ListParagraph"/>
+      </w:pPr>
+      <w:r>
+        <w:t xml:space="preserve">• </w:t>
+      </w:r>
+      <w:r>
+        <w:t>SharePoint Auto-Provision</w:t>
+      </w:r>
+    </w:p>
+    <w:p>
+      <w:pPr>
+        <w:pStyle w:val="ListParagraph"/>
+      </w:pPr>
+      <w:r>
+        <w:t xml:space="preserve">• </w:t>
+      </w:r>
+      <w:r>
+        <w:t>Power BI Dashboards</w:t>
+      </w:r>
+    </w:p>
+    <w:p>
+      <w:pPr>
+        <w:pStyle w:val="ListParagraph"/>
+      </w:pPr>
+      <w:r>
+        <w:t xml:space="preserve">• </w:t>
+      </w:r>
+      <w:r>
+        <w:t>RBAC / Business Units</w:t>
+      </w:r>
+    </w:p>
+    <w:p>
+      <w:pPr>
+        <w:pStyle w:val="ListParagraph"/>
+      </w:pPr>
+      <w:r>
+        <w:t xml:space="preserve">• </w:t>
+      </w:r>
+      <w:r>
+        <w:t>Engagement History</w:t>
+      </w:r>
+    </w:p>
+    <w:p>
+      <w:r>
+        <w:t>Core question answered: "Who is this client to Knight Frank across every service line, every country?"</w:t>
       </w:r>
     </w:p>
     <w:p>
@@ -12542,116 +12555,17 @@
         <w:pStyle w:val="Heading2"/>
       </w:pPr>
       <w:r>
-        <w:t>Shared Foundation</w:t>
-      </w:r>
-    </w:p>
-    <w:p>
-      <w:r>
-        <w:t>Designed to be reusable across service lines and countries:</w:t>
-      </w:r>
-    </w:p>
-    <w:p>
-      <w:pPr>
-        <w:pStyle w:val="ListParagraph"/>
-      </w:pPr>
-      <w:r>
-        <w:t xml:space="preserve">• </w:t>
-      </w:r>
-      <w:r>
-        <w:t>Accounts; Contacts; Properties; Engagement Tracking; Security</w:t>
-      </w:r>
-    </w:p>
-    <w:p>
-      <w:pPr>
-        <w:pStyle w:val="ListParagraph"/>
-      </w:pPr>
-      <w:r>
-        <w:t xml:space="preserve">• </w:t>
-      </w:r>
-      <w:r>
-        <w:t>Single Client Record</w:t>
-      </w:r>
-    </w:p>
-    <w:p>
-      <w:pPr>
-        <w:pStyle w:val="ListParagraph"/>
-      </w:pPr>
-      <w:r>
-        <w:t xml:space="preserve">• </w:t>
-      </w:r>
-      <w:r>
-        <w:t>Cross-SL Contact Intelligence</w:t>
-      </w:r>
-    </w:p>
-    <w:p>
-      <w:pPr>
-        <w:pStyle w:val="ListParagraph"/>
-      </w:pPr>
-      <w:r>
-        <w:t xml:space="preserve">• </w:t>
-      </w:r>
-      <w:r>
-        <w:t>Shared Property Records</w:t>
-      </w:r>
-    </w:p>
-    <w:p>
-      <w:pPr>
-        <w:pStyle w:val="ListParagraph"/>
-      </w:pPr>
-      <w:r>
-        <w:t xml:space="preserve">• </w:t>
-      </w:r>
-      <w:r>
-        <w:t>Outlook Integration</w:t>
-      </w:r>
-    </w:p>
-    <w:p>
-      <w:pPr>
-        <w:pStyle w:val="ListParagraph"/>
-      </w:pPr>
-      <w:r>
-        <w:t xml:space="preserve">• </w:t>
-      </w:r>
-      <w:r>
-        <w:t>SharePoint Auto-Provision</w:t>
-      </w:r>
-    </w:p>
-    <w:p>
-      <w:pPr>
-        <w:pStyle w:val="ListParagraph"/>
-      </w:pPr>
-      <w:r>
-        <w:t xml:space="preserve">• </w:t>
-      </w:r>
-      <w:r>
-        <w:t>Power BI Dashboards</w:t>
-      </w:r>
-    </w:p>
-    <w:p>
-      <w:pPr>
-        <w:pStyle w:val="ListParagraph"/>
-      </w:pPr>
-      <w:r>
-        <w:t xml:space="preserve">• </w:t>
-      </w:r>
-      <w:r>
-        <w:t>RBAC / Business Units</w:t>
-      </w:r>
-    </w:p>
-    <w:p>
-      <w:pPr>
-        <w:pStyle w:val="ListParagraph"/>
-      </w:pPr>
-      <w:r>
-        <w:t xml:space="preserve">• </w:t>
-      </w:r>
-      <w:r>
-        <w:t>Engagement History</w:t>
-      </w:r>
-    </w:p>
-    <w:p>
-      <w:r>
-        <w:t>Core question answered: "Who is this client to Knight Frank across every service line, every country?"</w:t>
+        <w:t>First Service-Line Build</w:t>
+      </w:r>
+    </w:p>
+    <w:p>
+      <w:r>
+        <w:t>Capital Markets is the first vertical deployed on the shared foundation.</w:t>
+      </w:r>
+    </w:p>
+    <w:p>
+      <w:r>
+        <w:t>OSS, Valuations, etc. follow as separate Service Line solutions on the same backbone.</w:t>
       </w:r>
     </w:p>
     <w:p>
@@ -12659,17 +12573,29 @@
         <w:pStyle w:val="Heading2"/>
       </w:pPr>
       <w:r>
-        <w:t>First Service-Line Build</w:t>
-      </w:r>
-    </w:p>
-    <w:p>
-      <w:r>
-        <w:t>Capital Markets is the first vertical deployed on the shared foundation.</w:t>
-      </w:r>
-    </w:p>
-    <w:p>
-      <w:r>
-        <w:t>OSS, Valuations, etc. follow as separate Service Line solutions on the same backbone.</w:t>
+        <w:t>Core Master Data Requirements</w:t>
+      </w:r>
+    </w:p>
+    <w:p>
+      <w:pPr>
+        <w:pStyle w:val="ListParagraph"/>
+      </w:pPr>
+      <w:r>
+        <w:t xml:space="preserve">• </w:t>
+      </w:r>
+      <w:r>
+        <w:t>Single trusted view of property and clients across service lines and countries</w:t>
+      </w:r>
+    </w:p>
+    <w:p>
+      <w:pPr>
+        <w:pStyle w:val="ListParagraph"/>
+      </w:pPr>
+      <w:r>
+        <w:t xml:space="preserve">• </w:t>
+      </w:r>
+      <w:r>
+        <w:t>International standards for property and client type definitions</w:t>
       </w:r>
     </w:p>
     <w:p>
@@ -12677,29 +12603,29 @@
         <w:pStyle w:val="Heading2"/>
       </w:pPr>
       <w:r>
-        <w:t>Core Master Data Requirements</w:t>
-      </w:r>
-    </w:p>
-    <w:p>
-      <w:pPr>
-        <w:pStyle w:val="ListParagraph"/>
-      </w:pPr>
-      <w:r>
-        <w:t xml:space="preserve">• </w:t>
-      </w:r>
-      <w:r>
-        <w:t>Single trusted view of property and clients across service lines and countries</w:t>
-      </w:r>
-    </w:p>
-    <w:p>
-      <w:pPr>
-        <w:pStyle w:val="ListParagraph"/>
-      </w:pPr>
-      <w:r>
-        <w:t xml:space="preserve">• </w:t>
-      </w:r>
-      <w:r>
-        <w:t>International standards for property and client type definitions</w:t>
+        <w:t>Pipeline &amp; Relationships Requirements</w:t>
+      </w:r>
+    </w:p>
+    <w:p>
+      <w:pPr>
+        <w:pStyle w:val="ListParagraph"/>
+      </w:pPr>
+      <w:r>
+        <w:t xml:space="preserve">• </w:t>
+      </w:r>
+      <w:r>
+        <w:t>Engagement tracking and cross-border unified client view</w:t>
+      </w:r>
+    </w:p>
+    <w:p>
+      <w:pPr>
+        <w:pStyle w:val="ListParagraph"/>
+      </w:pPr>
+      <w:r>
+        <w:t xml:space="preserve">• </w:t>
+      </w:r>
+      <w:r>
+        <w:t>Full pipeline visibility with built-in WIP data</w:t>
       </w:r>
     </w:p>
     <w:p>
@@ -12707,29 +12633,51 @@
         <w:pStyle w:val="Heading2"/>
       </w:pPr>
       <w:r>
-        <w:t>Pipeline &amp; Relationships Requirements</w:t>
-      </w:r>
-    </w:p>
-    <w:p>
-      <w:pPr>
-        <w:pStyle w:val="ListParagraph"/>
-      </w:pPr>
-      <w:r>
-        <w:t xml:space="preserve">• </w:t>
-      </w:r>
-      <w:r>
-        <w:t>Engagement tracking and cross-border unified client view</w:t>
-      </w:r>
-    </w:p>
-    <w:p>
-      <w:pPr>
-        <w:pStyle w:val="ListParagraph"/>
-      </w:pPr>
-      <w:r>
-        <w:t xml:space="preserve">• </w:t>
-      </w:r>
-      <w:r>
-        <w:t>Full pipeline visibility with built-in WIP data</w:t>
+        <w:t>Productivity Tools Requirements</w:t>
+      </w:r>
+    </w:p>
+    <w:p>
+      <w:pPr>
+        <w:pStyle w:val="ListParagraph"/>
+      </w:pPr>
+      <w:r>
+        <w:t xml:space="preserve">• </w:t>
+      </w:r>
+      <w:r>
+        <w:t>Outlook sync</w:t>
+      </w:r>
+    </w:p>
+    <w:p>
+      <w:pPr>
+        <w:pStyle w:val="ListParagraph"/>
+      </w:pPr>
+      <w:r>
+        <w:t xml:space="preserve">• </w:t>
+      </w:r>
+      <w:r>
+        <w:t>SharePoint libraries</w:t>
+      </w:r>
+    </w:p>
+    <w:p>
+      <w:pPr>
+        <w:pStyle w:val="ListParagraph"/>
+      </w:pPr>
+      <w:r>
+        <w:t xml:space="preserve">• </w:t>
+      </w:r>
+      <w:r>
+        <w:t>Power BI dashboards</w:t>
+      </w:r>
+    </w:p>
+    <w:p>
+      <w:pPr>
+        <w:pStyle w:val="ListParagraph"/>
+      </w:pPr>
+      <w:r>
+        <w:t xml:space="preserve">• </w:t>
+      </w:r>
+      <w:r>
+        <w:t>Copilot for Sales</w:t>
       </w:r>
     </w:p>
     <w:p>
@@ -12737,51 +12685,29 @@
         <w:pStyle w:val="Heading2"/>
       </w:pPr>
       <w:r>
-        <w:t>Productivity Tools Requirements</w:t>
-      </w:r>
-    </w:p>
-    <w:p>
-      <w:pPr>
-        <w:pStyle w:val="ListParagraph"/>
-      </w:pPr>
-      <w:r>
-        <w:t xml:space="preserve">• </w:t>
-      </w:r>
-      <w:r>
-        <w:t>Outlook sync</w:t>
-      </w:r>
-    </w:p>
-    <w:p>
-      <w:pPr>
-        <w:pStyle w:val="ListParagraph"/>
-      </w:pPr>
-      <w:r>
-        <w:t xml:space="preserve">• </w:t>
-      </w:r>
-      <w:r>
-        <w:t>SharePoint libraries</w:t>
-      </w:r>
-    </w:p>
-    <w:p>
-      <w:pPr>
-        <w:pStyle w:val="ListParagraph"/>
-      </w:pPr>
-      <w:r>
-        <w:t xml:space="preserve">• </w:t>
-      </w:r>
-      <w:r>
-        <w:t>Power BI dashboards</w:t>
-      </w:r>
-    </w:p>
-    <w:p>
-      <w:pPr>
-        <w:pStyle w:val="ListParagraph"/>
-      </w:pPr>
-      <w:r>
-        <w:t xml:space="preserve">• </w:t>
-      </w:r>
-      <w:r>
-        <w:t>Copilot for Sales</w:t>
+        <w:t>Data Architecture Requirements</w:t>
+      </w:r>
+    </w:p>
+    <w:p>
+      <w:pPr>
+        <w:pStyle w:val="ListParagraph"/>
+      </w:pPr>
+      <w:r>
+        <w:t xml:space="preserve">• </w:t>
+      </w:r>
+      <w:r>
+        <w:t>Layered Dataverse structure</w:t>
+      </w:r>
+    </w:p>
+    <w:p>
+      <w:pPr>
+        <w:pStyle w:val="ListParagraph"/>
+      </w:pPr>
+      <w:r>
+        <w:t xml:space="preserve">• </w:t>
+      </w:r>
+      <w:r>
+        <w:t>Layer 2 core, Layer 3 EUR defaults, Layer 4 country extensions, Layer 5 Service Line BPFs</w:t>
       </w:r>
     </w:p>
     <w:p>
@@ -12789,36 +12715,6 @@
         <w:pStyle w:val="Heading2"/>
       </w:pPr>
       <w:r>
-        <w:t>Data Architecture Requirements</w:t>
-      </w:r>
-    </w:p>
-    <w:p>
-      <w:pPr>
-        <w:pStyle w:val="ListParagraph"/>
-      </w:pPr>
-      <w:r>
-        <w:t xml:space="preserve">• </w:t>
-      </w:r>
-      <w:r>
-        <w:t>Layered Dataverse structure</w:t>
-      </w:r>
-    </w:p>
-    <w:p>
-      <w:pPr>
-        <w:pStyle w:val="ListParagraph"/>
-      </w:pPr>
-      <w:r>
-        <w:t xml:space="preserve">• </w:t>
-      </w:r>
-      <w:r>
-        <w:t>Layer 2 core, Layer 3 EUR defaults, Layer 4 country extensions, Layer 5 Service Line BPFs</w:t>
-      </w:r>
-    </w:p>
-    <w:p>
-      <w:pPr>
-        <w:pStyle w:val="Heading2"/>
-      </w:pPr>
-      <w:r>
         <w:t>Security &amp; Compliance Requirements</w:t>
       </w:r>
     </w:p>
@@ -12855,14 +12751,6 @@
       </w:pPr>
       <w:r>
         <w:t>Solution Architecture</w:t>
-      </w:r>
-    </w:p>
-    <w:p>
-      <w:pPr>
-        <w:pStyle w:val="Heading2"/>
-      </w:pPr>
-      <w:r>
-        <w:t>Architecture Overview Diagrams</w:t>
       </w:r>
     </w:p>
     <w:p>
@@ -13125,14 +13013,6 @@
         <w:pStyle w:val="Heading2"/>
       </w:pPr>
       <w:r>
-        <w:t>Architecture Key Components</w:t>
-      </w:r>
-    </w:p>
-    <w:p>
-      <w:pPr>
-        <w:pStyle w:val="Heading2"/>
-      </w:pPr>
-      <w:r>
         <w:t>Architecture — Key Components</w:t>
       </w:r>
     </w:p>
@@ -15062,14 +14942,6 @@
       </w:r>
       <w:r>
         <w:t>architecture diagram — Visual component diagram</w:t>
-      </w:r>
-    </w:p>
-    <w:p>
-      <w:pPr>
-        <w:pStyle w:val="Heading2"/>
-      </w:pPr>
-      <w:r>
-        <w:t>Architecture Business</w:t>
       </w:r>
     </w:p>
     <w:p>
@@ -17296,14 +17168,6 @@
         <w:pStyle w:val="Heading2"/>
       </w:pPr>
       <w:r>
-        <w:t>Architecture Application</w:t>
-      </w:r>
-    </w:p>
-    <w:p>
-      <w:pPr>
-        <w:pStyle w:val="Heading2"/>
-      </w:pPr>
-      <w:r>
         <w:t>Architecture — Application</w:t>
       </w:r>
     </w:p>
@@ -20722,14 +20586,6 @@
         <w:pStyle w:val="Heading2"/>
       </w:pPr>
       <w:r>
-        <w:t>Architecture Data</w:t>
-      </w:r>
-    </w:p>
-    <w:p>
-      <w:pPr>
-        <w:pStyle w:val="Heading2"/>
-      </w:pPr>
-      <w:r>
         <w:t>Architecture — Data</w:t>
       </w:r>
     </w:p>
@@ -23441,14 +23297,6 @@
       </w:r>
       <w:r>
         <w:t>data model core tables — Layer 2 table definitions</w:t>
-      </w:r>
-    </w:p>
-    <w:p>
-      <w:pPr>
-        <w:pStyle w:val="Heading2"/>
-      </w:pPr>
-      <w:r>
-        <w:t>Architecture Technology</w:t>
       </w:r>
     </w:p>
     <w:p>
@@ -26218,14 +26066,6 @@
       </w:r>
       <w:r>
         <w:t>power apps rationale — Platform selection</w:t>
-      </w:r>
-    </w:p>
-    <w:p>
-      <w:pPr>
-        <w:pStyle w:val="Heading2"/>
-      </w:pPr>
-      <w:r>
-        <w:t>Client Data Model</w:t>
       </w:r>
     </w:p>
     <w:p>
@@ -26846,14 +26686,6 @@
         <w:pStyle w:val="Heading2"/>
       </w:pPr>
       <w:r>
-        <w:t>Property Data Model</w:t>
-      </w:r>
-    </w:p>
-    <w:p>
-      <w:pPr>
-        <w:pStyle w:val="Heading2"/>
-      </w:pPr>
-      <w:r>
         <w:t>Property Data Model — Site, Property, Deal</w:t>
       </w:r>
     </w:p>
@@ -28603,14 +28435,6 @@
       </w:r>
     </w:p>
     <w:p>
-      <w:pPr>
-        <w:pStyle w:val="Heading2"/>
-      </w:pPr>
-      <w:r>
-        <w:t>Capital Markets Data Model</w:t>
-      </w:r>
-    </w:p>
-    <w:p>
       <w:r>
         <w:t>Status: Draft Parent: solution overview Source: European CRM Architecture Review 2.pdf</w:t>
       </w:r>
@@ -30185,14 +30009,6 @@
         <w:pStyle w:val="Heading2"/>
       </w:pPr>
       <w:r>
-        <w:t>Wip Data Model</w:t>
-      </w:r>
-    </w:p>
-    <w:p>
-      <w:pPr>
-        <w:pStyle w:val="Heading2"/>
-      </w:pPr>
-      <w:r>
         <w:t>WIP Data Model — Work in Progress</w:t>
       </w:r>
     </w:p>
@@ -31043,14 +30859,6 @@
         <w:pStyle w:val="Heading2"/>
       </w:pPr>
       <w:r>
-        <w:t>Data Model Overview</w:t>
-      </w:r>
-    </w:p>
-    <w:p>
-      <w:pPr>
-        <w:pStyle w:val="Heading2"/>
-      </w:pPr>
-      <w:r>
         <w:t>EU CRM Data Model</w:t>
       </w:r>
     </w:p>
@@ -32599,14 +32407,6 @@
       </w:r>
       <w:r>
         <w:t>capital markets data model — Capital Markets entity definitions</w:t>
-      </w:r>
-    </w:p>
-    <w:p>
-      <w:pPr>
-        <w:pStyle w:val="Heading2"/>
-      </w:pPr>
-      <w:r>
-        <w:t>Data Model Core Tables</w:t>
       </w:r>
     </w:p>
     <w:p>
@@ -34283,14 +34083,6 @@
         <w:pStyle w:val="Heading2"/>
       </w:pPr>
       <w:r>
-        <w:t>Solution Package Model</w:t>
-      </w:r>
-    </w:p>
-    <w:p>
-      <w:pPr>
-        <w:pStyle w:val="Heading2"/>
-      </w:pPr>
-      <w:r>
         <w:t>Solution Package Model — Layered Architecture</w:t>
       </w:r>
     </w:p>
@@ -34773,14 +34565,6 @@
       </w:r>
       <w:r>
         <w:t>Columns and relationships added by higher layers</w:t>
-      </w:r>
-    </w:p>
-    <w:p>
-      <w:pPr>
-        <w:pStyle w:val="Heading2"/>
-      </w:pPr>
-      <w:r>
-        <w:t>Taxonomy Mappings</w:t>
       </w:r>
     </w:p>
     <w:p>
@@ -36572,14 +36356,6 @@
     <w:p>
       <w:r>
         <w:t>See taxonomy hilucs kf for the complete mapping of all Knight Frank sectors and asset classes.</w:t>
-      </w:r>
-    </w:p>
-    <w:p>
-      <w:pPr>
-        <w:pStyle w:val="Heading2"/>
-      </w:pPr>
-      <w:r>
-        <w:t>Taxonomy Hilucs Kf</w:t>
       </w:r>
     </w:p>
     <w:p>
@@ -40051,14 +39827,6 @@
         <w:pStyle w:val="Heading2"/>
       </w:pPr>
       <w:r>
-        <w:t>Taxonomy Sic Kf</w:t>
-      </w:r>
-    </w:p>
-    <w:p>
-      <w:pPr>
-        <w:pStyle w:val="Heading2"/>
-      </w:pPr>
-      <w:r>
         <w:t>SIC to KF Client Sector Mapping</w:t>
       </w:r>
     </w:p>
@@ -43606,14 +43374,6 @@
         <w:pStyle w:val="Heading2"/>
       </w:pPr>
       <w:r>
-        <w:t>Architecture Principles Compliance</w:t>
-      </w:r>
-    </w:p>
-    <w:p>
-      <w:pPr>
-        <w:pStyle w:val="Heading2"/>
-      </w:pPr>
-      <w:r>
         <w:t>Architecture — Principles Compliance</w:t>
       </w:r>
     </w:p>
@@ -45220,14 +44980,6 @@
       </w:r>
       <w:r>
         <w:t>architecture application — Application components</w:t>
-      </w:r>
-    </w:p>
-    <w:p>
-      <w:pPr>
-        <w:pStyle w:val="Heading2"/>
-      </w:pPr>
-      <w:r>
-        <w:t>Architecture Target State</w:t>
       </w:r>
     </w:p>
     <w:p>
@@ -46863,14 +46615,6 @@
         <w:pStyle w:val="Heading2"/>
       </w:pPr>
       <w:r>
-        <w:t>Dependencies And Constraints</w:t>
-      </w:r>
-    </w:p>
-    <w:p>
-      <w:pPr>
-        <w:pStyle w:val="Heading2"/>
-      </w:pPr>
-      <w:r>
         <w:t>Dependencies and Constraints</w:t>
       </w:r>
     </w:p>
@@ -47317,11 +47061,152 @@
       </w:r>
     </w:p>
     <w:p>
+      <w:r>
+        <w:t>Status: Draft Parent: solution overview</w:t>
+      </w:r>
+    </w:p>
+    <w:p>
       <w:pPr>
         <w:pStyle w:val="Heading2"/>
       </w:pPr>
       <w:r>
-        <w:t>Functional Requirements</w:t>
+        <w:t>Requirements</w:t>
+      </w:r>
+    </w:p>
+    <w:p>
+      <w:r>
+        <w:t>To be gathered from business stakeholders across all four regions.</w:t>
+      </w:r>
+    </w:p>
+    <w:p>
+      <w:pPr>
+        <w:pStyle w:val="Heading3"/>
+      </w:pPr>
+      <w:r>
+        <w:t>Contact Management</w:t>
+      </w:r>
+    </w:p>
+    <w:p>
+      <w:pPr>
+        <w:pStyle w:val="ListParagraph"/>
+      </w:pPr>
+      <w:r>
+        <w:t xml:space="preserve">• </w:t>
+      </w:r>
+      <w:r>
+        <w:t>Create, read, update, delete contacts</w:t>
+      </w:r>
+    </w:p>
+    <w:p>
+      <w:pPr>
+        <w:pStyle w:val="ListParagraph"/>
+      </w:pPr>
+      <w:r>
+        <w:t xml:space="preserve">• </w:t>
+      </w:r>
+      <w:r>
+        <w:t>Contact hierarchy and relationships</w:t>
+      </w:r>
+    </w:p>
+    <w:p>
+      <w:pPr>
+        <w:pStyle w:val="ListParagraph"/>
+      </w:pPr>
+      <w:r>
+        <w:t xml:space="preserve">• </w:t>
+      </w:r>
+      <w:r>
+        <w:t>Multi-language support</w:t>
+      </w:r>
+    </w:p>
+    <w:p>
+      <w:pPr>
+        <w:pStyle w:val="Heading3"/>
+      </w:pPr>
+      <w:r>
+        <w:t>Opportunity Management</w:t>
+      </w:r>
+    </w:p>
+    <w:p>
+      <w:pPr>
+        <w:pStyle w:val="ListParagraph"/>
+      </w:pPr>
+      <w:r>
+        <w:t xml:space="preserve">• </w:t>
+      </w:r>
+      <w:r>
+        <w:t>Pipeline stages and workflows</w:t>
+      </w:r>
+    </w:p>
+    <w:p>
+      <w:pPr>
+        <w:pStyle w:val="ListParagraph"/>
+      </w:pPr>
+      <w:r>
+        <w:t xml:space="preserve">• </w:t>
+      </w:r>
+      <w:r>
+        <w:t>Activity tracking</w:t>
+      </w:r>
+    </w:p>
+    <w:p>
+      <w:pPr>
+        <w:pStyle w:val="ListParagraph"/>
+      </w:pPr>
+      <w:r>
+        <w:t xml:space="preserve">• </w:t>
+      </w:r>
+      <w:r>
+        <w:t>Reporting and analytics</w:t>
+      </w:r>
+    </w:p>
+    <w:p>
+      <w:pPr>
+        <w:pStyle w:val="Heading3"/>
+      </w:pPr>
+      <w:r>
+        <w:t>Data Management</w:t>
+      </w:r>
+    </w:p>
+    <w:p>
+      <w:pPr>
+        <w:pStyle w:val="ListParagraph"/>
+      </w:pPr>
+      <w:r>
+        <w:t xml:space="preserve">• </w:t>
+      </w:r>
+      <w:r>
+        <w:t>Import/export capabilities</w:t>
+      </w:r>
+    </w:p>
+    <w:p>
+      <w:pPr>
+        <w:pStyle w:val="ListParagraph"/>
+      </w:pPr>
+      <w:r>
+        <w:t xml:space="preserve">• </w:t>
+      </w:r>
+      <w:r>
+        <w:t>Data quality controls</w:t>
+      </w:r>
+    </w:p>
+    <w:p>
+      <w:pPr>
+        <w:pStyle w:val="ListParagraph"/>
+      </w:pPr>
+      <w:r>
+        <w:t xml:space="preserve">• </w:t>
+      </w:r>
+      <w:r>
+        <w:t>Duplicate detection</w:t>
+      </w:r>
+    </w:p>
+    <w:p>
+      <w:pPr>
+        <w:pStyle w:val="Heading2"/>
+      </w:pPr>
+      <w:r>
+        <w:t>Non-Functional Requirements</w:t>
       </w:r>
     </w:p>
     <w:p>
@@ -47334,135 +47219,40 @@
         <w:pStyle w:val="Heading2"/>
       </w:pPr>
       <w:r>
-        <w:t>Requirements</w:t>
-      </w:r>
-    </w:p>
-    <w:p>
-      <w:r>
-        <w:t>To be gathered from business stakeholders across all four regions.</w:t>
-      </w:r>
-    </w:p>
-    <w:p>
-      <w:pPr>
-        <w:pStyle w:val="Heading3"/>
-      </w:pPr>
-      <w:r>
-        <w:t>Contact Management</w:t>
-      </w:r>
-    </w:p>
-    <w:p>
-      <w:pPr>
-        <w:pStyle w:val="ListParagraph"/>
-      </w:pPr>
-      <w:r>
-        <w:t xml:space="preserve">• </w:t>
-      </w:r>
-      <w:r>
-        <w:t>Create, read, update, delete contacts</w:t>
-      </w:r>
-    </w:p>
-    <w:p>
-      <w:pPr>
-        <w:pStyle w:val="ListParagraph"/>
-      </w:pPr>
-      <w:r>
-        <w:t xml:space="preserve">• </w:t>
-      </w:r>
-      <w:r>
-        <w:t>Contact hierarchy and relationships</w:t>
-      </w:r>
-    </w:p>
-    <w:p>
-      <w:pPr>
-        <w:pStyle w:val="ListParagraph"/>
-      </w:pPr>
-      <w:r>
-        <w:t xml:space="preserve">• </w:t>
-      </w:r>
-      <w:r>
-        <w:t>Multi-language support</w:t>
-      </w:r>
-    </w:p>
-    <w:p>
-      <w:pPr>
-        <w:pStyle w:val="Heading3"/>
-      </w:pPr>
-      <w:r>
-        <w:t>Opportunity Management</w:t>
-      </w:r>
-    </w:p>
-    <w:p>
-      <w:pPr>
-        <w:pStyle w:val="ListParagraph"/>
-      </w:pPr>
-      <w:r>
-        <w:t xml:space="preserve">• </w:t>
-      </w:r>
-      <w:r>
-        <w:t>Pipeline stages and workflows</w:t>
-      </w:r>
-    </w:p>
-    <w:p>
-      <w:pPr>
-        <w:pStyle w:val="ListParagraph"/>
-      </w:pPr>
-      <w:r>
-        <w:t xml:space="preserve">• </w:t>
-      </w:r>
-      <w:r>
-        <w:t>Activity tracking</w:t>
-      </w:r>
-    </w:p>
-    <w:p>
-      <w:pPr>
-        <w:pStyle w:val="ListParagraph"/>
-      </w:pPr>
-      <w:r>
-        <w:t xml:space="preserve">• </w:t>
-      </w:r>
-      <w:r>
-        <w:t>Reporting and analytics</w:t>
-      </w:r>
-    </w:p>
-    <w:p>
-      <w:pPr>
-        <w:pStyle w:val="Heading3"/>
-      </w:pPr>
-      <w:r>
-        <w:t>Data Management</w:t>
-      </w:r>
-    </w:p>
-    <w:p>
-      <w:pPr>
-        <w:pStyle w:val="ListParagraph"/>
-      </w:pPr>
-      <w:r>
-        <w:t xml:space="preserve">• </w:t>
-      </w:r>
-      <w:r>
-        <w:t>Import/export capabilities</w:t>
-      </w:r>
-    </w:p>
-    <w:p>
-      <w:pPr>
-        <w:pStyle w:val="ListParagraph"/>
-      </w:pPr>
-      <w:r>
-        <w:t xml:space="preserve">• </w:t>
-      </w:r>
-      <w:r>
-        <w:t>Data quality controls</w:t>
-      </w:r>
-    </w:p>
-    <w:p>
-      <w:pPr>
-        <w:pStyle w:val="ListParagraph"/>
-      </w:pPr>
-      <w:r>
-        <w:t xml:space="preserve">• </w:t>
-      </w:r>
-      <w:r>
-        <w:t>Duplicate detection</w:t>
+        <w:t>Performance</w:t>
+      </w:r>
+    </w:p>
+    <w:p>
+      <w:pPr>
+        <w:pStyle w:val="ListParagraph"/>
+      </w:pPr>
+      <w:r>
+        <w:t xml:space="preserve">• </w:t>
+      </w:r>
+      <w:r>
+        <w:t>Response time targets: TBD</w:t>
+      </w:r>
+    </w:p>
+    <w:p>
+      <w:pPr>
+        <w:pStyle w:val="ListParagraph"/>
+      </w:pPr>
+      <w:r>
+        <w:t xml:space="preserve">• </w:t>
+      </w:r>
+      <w:r>
+        <w:t>Concurrent user capacity: TBD</w:t>
+      </w:r>
+    </w:p>
+    <w:p>
+      <w:pPr>
+        <w:pStyle w:val="ListParagraph"/>
+      </w:pPr>
+      <w:r>
+        <w:t xml:space="preserve">• </w:t>
+      </w:r>
+      <w:r>
+        <w:t>Data volume requirements: TBD</w:t>
       </w:r>
     </w:p>
     <w:p>
@@ -47470,7 +47260,51 @@
         <w:pStyle w:val="Heading2"/>
       </w:pPr>
       <w:r>
-        <w:t>Functional Non Functional Requirements</w:t>
+        <w:t>Security</w:t>
+      </w:r>
+    </w:p>
+    <w:p>
+      <w:pPr>
+        <w:pStyle w:val="ListParagraph"/>
+      </w:pPr>
+      <w:r>
+        <w:t xml:space="preserve">• </w:t>
+      </w:r>
+      <w:r>
+        <w:t>Authentication method: TBD</w:t>
+      </w:r>
+    </w:p>
+    <w:p>
+      <w:pPr>
+        <w:pStyle w:val="ListParagraph"/>
+      </w:pPr>
+      <w:r>
+        <w:t xml:space="preserve">• </w:t>
+      </w:r>
+      <w:r>
+        <w:t>Authorisation model: TBD</w:t>
+      </w:r>
+    </w:p>
+    <w:p>
+      <w:pPr>
+        <w:pStyle w:val="ListParagraph"/>
+      </w:pPr>
+      <w:r>
+        <w:t xml:space="preserve">• </w:t>
+      </w:r>
+      <w:r>
+        <w:t>Data encryption: TBD</w:t>
+      </w:r>
+    </w:p>
+    <w:p>
+      <w:pPr>
+        <w:pStyle w:val="ListParagraph"/>
+      </w:pPr>
+      <w:r>
+        <w:t xml:space="preserve">• </w:t>
+      </w:r>
+      <w:r>
+        <w:t>Audit logging: TBD</w:t>
       </w:r>
     </w:p>
     <w:p>
@@ -47478,12 +47312,40 @@
         <w:pStyle w:val="Heading2"/>
       </w:pPr>
       <w:r>
-        <w:t>Non-Functional Requirements</w:t>
-      </w:r>
-    </w:p>
-    <w:p>
-      <w:r>
-        <w:t>Status: Draft Parent: solution overview</w:t>
+        <w:t>Compliance</w:t>
+      </w:r>
+    </w:p>
+    <w:p>
+      <w:pPr>
+        <w:pStyle w:val="ListParagraph"/>
+      </w:pPr>
+      <w:r>
+        <w:t xml:space="preserve">• </w:t>
+      </w:r>
+      <w:r>
+        <w:t>GDPR requirements: TBD</w:t>
+      </w:r>
+    </w:p>
+    <w:p>
+      <w:pPr>
+        <w:pStyle w:val="ListParagraph"/>
+      </w:pPr>
+      <w:r>
+        <w:t xml:space="preserve">• </w:t>
+      </w:r>
+      <w:r>
+        <w:t>Regional data residency: TBD</w:t>
+      </w:r>
+    </w:p>
+    <w:p>
+      <w:pPr>
+        <w:pStyle w:val="ListParagraph"/>
+      </w:pPr>
+      <w:r>
+        <w:t xml:space="preserve">• </w:t>
+      </w:r>
+      <w:r>
+        <w:t>Data retention policies: TBD</w:t>
       </w:r>
     </w:p>
     <w:p>
@@ -47491,140 +47353,6 @@
         <w:pStyle w:val="Heading2"/>
       </w:pPr>
       <w:r>
-        <w:t>Performance</w:t>
-      </w:r>
-    </w:p>
-    <w:p>
-      <w:pPr>
-        <w:pStyle w:val="ListParagraph"/>
-      </w:pPr>
-      <w:r>
-        <w:t xml:space="preserve">• </w:t>
-      </w:r>
-      <w:r>
-        <w:t>Response time targets: TBD</w:t>
-      </w:r>
-    </w:p>
-    <w:p>
-      <w:pPr>
-        <w:pStyle w:val="ListParagraph"/>
-      </w:pPr>
-      <w:r>
-        <w:t xml:space="preserve">• </w:t>
-      </w:r>
-      <w:r>
-        <w:t>Concurrent user capacity: TBD</w:t>
-      </w:r>
-    </w:p>
-    <w:p>
-      <w:pPr>
-        <w:pStyle w:val="ListParagraph"/>
-      </w:pPr>
-      <w:r>
-        <w:t xml:space="preserve">• </w:t>
-      </w:r>
-      <w:r>
-        <w:t>Data volume requirements: TBD</w:t>
-      </w:r>
-    </w:p>
-    <w:p>
-      <w:pPr>
-        <w:pStyle w:val="Heading2"/>
-      </w:pPr>
-      <w:r>
-        <w:t>Security</w:t>
-      </w:r>
-    </w:p>
-    <w:p>
-      <w:pPr>
-        <w:pStyle w:val="ListParagraph"/>
-      </w:pPr>
-      <w:r>
-        <w:t xml:space="preserve">• </w:t>
-      </w:r>
-      <w:r>
-        <w:t>Authentication method: TBD</w:t>
-      </w:r>
-    </w:p>
-    <w:p>
-      <w:pPr>
-        <w:pStyle w:val="ListParagraph"/>
-      </w:pPr>
-      <w:r>
-        <w:t xml:space="preserve">• </w:t>
-      </w:r>
-      <w:r>
-        <w:t>Authorisation model: TBD</w:t>
-      </w:r>
-    </w:p>
-    <w:p>
-      <w:pPr>
-        <w:pStyle w:val="ListParagraph"/>
-      </w:pPr>
-      <w:r>
-        <w:t xml:space="preserve">• </w:t>
-      </w:r>
-      <w:r>
-        <w:t>Data encryption: TBD</w:t>
-      </w:r>
-    </w:p>
-    <w:p>
-      <w:pPr>
-        <w:pStyle w:val="ListParagraph"/>
-      </w:pPr>
-      <w:r>
-        <w:t xml:space="preserve">• </w:t>
-      </w:r>
-      <w:r>
-        <w:t>Audit logging: TBD</w:t>
-      </w:r>
-    </w:p>
-    <w:p>
-      <w:pPr>
-        <w:pStyle w:val="Heading2"/>
-      </w:pPr>
-      <w:r>
-        <w:t>Compliance</w:t>
-      </w:r>
-    </w:p>
-    <w:p>
-      <w:pPr>
-        <w:pStyle w:val="ListParagraph"/>
-      </w:pPr>
-      <w:r>
-        <w:t xml:space="preserve">• </w:t>
-      </w:r>
-      <w:r>
-        <w:t>GDPR requirements: TBD</w:t>
-      </w:r>
-    </w:p>
-    <w:p>
-      <w:pPr>
-        <w:pStyle w:val="ListParagraph"/>
-      </w:pPr>
-      <w:r>
-        <w:t xml:space="preserve">• </w:t>
-      </w:r>
-      <w:r>
-        <w:t>Regional data residency: TBD</w:t>
-      </w:r>
-    </w:p>
-    <w:p>
-      <w:pPr>
-        <w:pStyle w:val="ListParagraph"/>
-      </w:pPr>
-      <w:r>
-        <w:t xml:space="preserve">• </w:t>
-      </w:r>
-      <w:r>
-        <w:t>Data retention policies: TBD</w:t>
-      </w:r>
-    </w:p>
-    <w:p>
-      <w:pPr>
-        <w:pStyle w:val="Heading2"/>
-      </w:pPr>
-      <w:r>
         <w:t>Availability</w:t>
       </w:r>
     </w:p>
@@ -47669,22 +47397,6 @@
     <w:p>
       <w:pPr>
         <w:pStyle w:val="Heading1"/>
-      </w:pPr>
-      <w:r>
-        <w:t>Risks and Issues</w:t>
-      </w:r>
-    </w:p>
-    <w:p>
-      <w:pPr>
-        <w:pStyle w:val="Heading2"/>
-      </w:pPr>
-      <w:r>
-        <w:t>Risks And Issues</w:t>
-      </w:r>
-    </w:p>
-    <w:p>
-      <w:pPr>
-        <w:pStyle w:val="Heading2"/>
       </w:pPr>
       <w:r>
         <w:t>Risks and Issues</w:t>
@@ -48107,11 +47819,103 @@
       </w:r>
     </w:p>
     <w:p>
+      <w:r>
+        <w:t>Status: Draft Parent: solution overview</w:t>
+      </w:r>
+    </w:p>
+    <w:p>
       <w:pPr>
         <w:pStyle w:val="Heading2"/>
       </w:pPr>
       <w:r>
-        <w:t>Solution Options</w:t>
+        <w:t>Options Analysis</w:t>
+      </w:r>
+    </w:p>
+    <w:p>
+      <w:r>
+        <w:t>To be completed with vendor evaluation and architecture assessment.</w:t>
+      </w:r>
+    </w:p>
+    <w:p>
+      <w:pPr>
+        <w:pStyle w:val="Heading3"/>
+      </w:pPr>
+      <w:r>
+        <w:t>Option 1: TBD</w:t>
+      </w:r>
+    </w:p>
+    <w:p>
+      <w:pPr>
+        <w:pStyle w:val="ListParagraph"/>
+      </w:pPr>
+      <w:r>
+        <w:t xml:space="preserve">• </w:t>
+      </w:r>
+      <w:r>
+        <w:t>Pros: TBD</w:t>
+      </w:r>
+    </w:p>
+    <w:p>
+      <w:pPr>
+        <w:pStyle w:val="ListParagraph"/>
+      </w:pPr>
+      <w:r>
+        <w:t xml:space="preserve">• </w:t>
+      </w:r>
+      <w:r>
+        <w:t>Cons: TBD</w:t>
+      </w:r>
+    </w:p>
+    <w:p>
+      <w:pPr>
+        <w:pStyle w:val="ListParagraph"/>
+      </w:pPr>
+      <w:r>
+        <w:t xml:space="preserve">• </w:t>
+      </w:r>
+      <w:r>
+        <w:t>Cost: TBD</w:t>
+      </w:r>
+    </w:p>
+    <w:p>
+      <w:pPr>
+        <w:pStyle w:val="Heading3"/>
+      </w:pPr>
+      <w:r>
+        <w:t>Option 2: TBD</w:t>
+      </w:r>
+    </w:p>
+    <w:p>
+      <w:pPr>
+        <w:pStyle w:val="ListParagraph"/>
+      </w:pPr>
+      <w:r>
+        <w:t xml:space="preserve">• </w:t>
+      </w:r>
+      <w:r>
+        <w:t>Pros: TBD</w:t>
+      </w:r>
+    </w:p>
+    <w:p>
+      <w:pPr>
+        <w:pStyle w:val="ListParagraph"/>
+      </w:pPr>
+      <w:r>
+        <w:t xml:space="preserve">• </w:t>
+      </w:r>
+      <w:r>
+        <w:t>Cons: TBD</w:t>
+      </w:r>
+    </w:p>
+    <w:p>
+      <w:pPr>
+        <w:pStyle w:val="ListParagraph"/>
+      </w:pPr>
+      <w:r>
+        <w:t xml:space="preserve">• </w:t>
+      </w:r>
+      <w:r>
+        <w:t>Cost: TBD</w:t>
       </w:r>
     </w:p>
     <w:p>
@@ -48119,128 +47923,12 @@
         <w:pStyle w:val="Heading2"/>
       </w:pPr>
       <w:r>
-        <w:t>Solution Options and Trade-offs</w:t>
-      </w:r>
-    </w:p>
-    <w:p>
-      <w:r>
-        <w:t>Status: Draft Parent: solution overview</w:t>
-      </w:r>
-    </w:p>
-    <w:p>
-      <w:pPr>
-        <w:pStyle w:val="Heading2"/>
-      </w:pPr>
-      <w:r>
-        <w:t>Options Analysis</w:t>
-      </w:r>
-    </w:p>
-    <w:p>
-      <w:r>
-        <w:t>To be completed with vendor evaluation and architecture assessment.</w:t>
-      </w:r>
-    </w:p>
-    <w:p>
-      <w:pPr>
-        <w:pStyle w:val="Heading3"/>
-      </w:pPr>
-      <w:r>
-        <w:t>Option 1: TBD</w:t>
-      </w:r>
-    </w:p>
-    <w:p>
-      <w:pPr>
-        <w:pStyle w:val="ListParagraph"/>
-      </w:pPr>
-      <w:r>
-        <w:t xml:space="preserve">• </w:t>
-      </w:r>
-      <w:r>
-        <w:t>Pros: TBD</w:t>
-      </w:r>
-    </w:p>
-    <w:p>
-      <w:pPr>
-        <w:pStyle w:val="ListParagraph"/>
-      </w:pPr>
-      <w:r>
-        <w:t xml:space="preserve">• </w:t>
-      </w:r>
-      <w:r>
-        <w:t>Cons: TBD</w:t>
-      </w:r>
-    </w:p>
-    <w:p>
-      <w:pPr>
-        <w:pStyle w:val="ListParagraph"/>
-      </w:pPr>
-      <w:r>
-        <w:t xml:space="preserve">• </w:t>
-      </w:r>
-      <w:r>
-        <w:t>Cost: TBD</w:t>
-      </w:r>
-    </w:p>
-    <w:p>
-      <w:pPr>
-        <w:pStyle w:val="Heading3"/>
-      </w:pPr>
-      <w:r>
-        <w:t>Option 2: TBD</w:t>
-      </w:r>
-    </w:p>
-    <w:p>
-      <w:pPr>
-        <w:pStyle w:val="ListParagraph"/>
-      </w:pPr>
-      <w:r>
-        <w:t xml:space="preserve">• </w:t>
-      </w:r>
-      <w:r>
-        <w:t>Pros: TBD</w:t>
-      </w:r>
-    </w:p>
-    <w:p>
-      <w:pPr>
-        <w:pStyle w:val="ListParagraph"/>
-      </w:pPr>
-      <w:r>
-        <w:t xml:space="preserve">• </w:t>
-      </w:r>
-      <w:r>
-        <w:t>Cons: TBD</w:t>
-      </w:r>
-    </w:p>
-    <w:p>
-      <w:pPr>
-        <w:pStyle w:val="ListParagraph"/>
-      </w:pPr>
-      <w:r>
-        <w:t xml:space="preserve">• </w:t>
-      </w:r>
-      <w:r>
-        <w:t>Cost: TBD</w:t>
-      </w:r>
-    </w:p>
-    <w:p>
-      <w:pPr>
-        <w:pStyle w:val="Heading2"/>
-      </w:pPr>
-      <w:r>
         <w:t>Recommendation</w:t>
       </w:r>
     </w:p>
     <w:p>
       <w:r>
         <w:t>Pending analysis.</w:t>
-      </w:r>
-    </w:p>
-    <w:p>
-      <w:pPr>
-        <w:pStyle w:val="Heading2"/>
-      </w:pPr>
-      <w:r>
-        <w:t>Power Apps Rationale</w:t>
       </w:r>
     </w:p>
     <w:p>
@@ -48568,14 +48256,6 @@
       </w:pPr>
       <w:r>
         <w:t>Implementation Roadmap</w:t>
-      </w:r>
-    </w:p>
-    <w:p>
-      <w:pPr>
-        <w:pStyle w:val="Heading2"/>
-      </w:pPr>
-      <w:r>
-        <w:t>Roadmap Phases</w:t>
       </w:r>
     </w:p>
     <w:p>
@@ -48803,14 +48483,6 @@
     <w:p>
       <w:r>
         <w:t>Phasing to be defined based on regional priorities and dependencies.</w:t>
-      </w:r>
-    </w:p>
-    <w:p>
-      <w:pPr>
-        <w:pStyle w:val="Heading2"/>
-      </w:pPr>
-      <w:r>
-        <w:t>Roadmap Timelines</w:t>
       </w:r>
     </w:p>
     <w:p>
@@ -52067,14 +51739,6 @@
         <w:pStyle w:val="Heading2"/>
       </w:pPr>
       <w:r>
-        <w:t>Roadmap Dependencies</w:t>
-      </w:r>
-    </w:p>
-    <w:p>
-      <w:pPr>
-        <w:pStyle w:val="Heading2"/>
-      </w:pPr>
-      <w:r>
         <w:t>Implementation Roadmap — Key Dependencies</w:t>
       </w:r>
     </w:p>
@@ -55039,14 +54703,6 @@
       </w:r>
     </w:p>
     <w:p>
-      <w:pPr>
-        <w:pStyle w:val="Heading2"/>
-      </w:pPr>
-      <w:r>
-        <w:t>Implementation Phases</w:t>
-      </w:r>
-    </w:p>
-    <w:p>
       <w:r>
         <w:t>Status: Draft Parent: solution overview Source: EU CRM Data Model.xlsx</w:t>
       </w:r>
@@ -58733,14 +58389,6 @@
       </w:r>
     </w:p>
     <w:p>
-      <w:pPr>
-        <w:pStyle w:val="Heading2"/>
-      </w:pPr>
-      <w:r>
-        <w:t>Cost Estimates</w:t>
-      </w:r>
-    </w:p>
-    <w:p>
       <w:r>
         <w:t>Status: Draft Parent: solution overview</w:t>
       </w:r>
@@ -59003,14 +58651,6 @@
     <w:p>
       <w:r>
         <w:t>To be developed during business case phase.</w:t>
-      </w:r>
-    </w:p>
-    <w:p>
-      <w:pPr>
-        <w:pStyle w:val="Heading2"/>
-      </w:pPr>
-      <w:r>
-        <w:t>Expected Benefits</w:t>
       </w:r>
     </w:p>
     <w:p>
@@ -59230,14 +58870,6 @@
       </w:pPr>
       <w:r>
         <w:t>Governance and Approval</w:t>
-      </w:r>
-    </w:p>
-    <w:p>
-      <w:pPr>
-        <w:pStyle w:val="Heading2"/>
-      </w:pPr>
-      <w:r>
-        <w:t>Governance Approval</w:t>
       </w:r>
     </w:p>
     <w:p>
@@ -59503,7 +59135,12 @@
         <w:pStyle w:val="Heading2"/>
       </w:pPr>
       <w:r>
-        <w:t>Governance Oversight</w:t>
+        <w:t>Governance — Oversight</w:t>
+      </w:r>
+    </w:p>
+    <w:p>
+      <w:r>
+        <w:t>Status: Draft Parent: solution overview</w:t>
       </w:r>
     </w:p>
     <w:p>
@@ -59511,12 +59148,12 @@
         <w:pStyle w:val="Heading2"/>
       </w:pPr>
       <w:r>
-        <w:t>Governance — Oversight</w:t>
-      </w:r>
-    </w:p>
-    <w:p>
-      <w:r>
-        <w:t>Status: Draft Parent: solution overview</w:t>
+        <w:t>Governance Structure</w:t>
+      </w:r>
+    </w:p>
+    <w:p>
+      <w:r>
+        <w:t>This solution is in the purview of the Technical Design Authority (TDA).</w:t>
       </w:r>
     </w:p>
     <w:p>
@@ -59524,12 +59161,51 @@
         <w:pStyle w:val="Heading2"/>
       </w:pPr>
       <w:r>
-        <w:t>Governance Structure</w:t>
-      </w:r>
-    </w:p>
-    <w:p>
-      <w:r>
-        <w:t>This solution is in the purview of the Technical Design Authority (TDA).</w:t>
+        <w:t>TDA Responsibilities</w:t>
+      </w:r>
+    </w:p>
+    <w:p>
+      <w:pPr>
+        <w:pStyle w:val="ListParagraph"/>
+      </w:pPr>
+      <w:r>
+        <w:t xml:space="preserve">• </w:t>
+      </w:r>
+      <w:r>
+        <w:t>Architecture review and approval</w:t>
+      </w:r>
+    </w:p>
+    <w:p>
+      <w:pPr>
+        <w:pStyle w:val="ListParagraph"/>
+      </w:pPr>
+      <w:r>
+        <w:t xml:space="preserve">• </w:t>
+      </w:r>
+      <w:r>
+        <w:t>Standards compliance oversight</w:t>
+      </w:r>
+    </w:p>
+    <w:p>
+      <w:pPr>
+        <w:pStyle w:val="ListParagraph"/>
+      </w:pPr>
+      <w:r>
+        <w:t xml:space="preserve">• </w:t>
+      </w:r>
+      <w:r>
+        <w:t>Design authority for technical decisions</w:t>
+      </w:r>
+    </w:p>
+    <w:p>
+      <w:pPr>
+        <w:pStyle w:val="ListParagraph"/>
+      </w:pPr>
+      <w:r>
+        <w:t xml:space="preserve">• </w:t>
+      </w:r>
+      <w:r>
+        <w:t>Escalation point for architectural conflicts</w:t>
       </w:r>
     </w:p>
     <w:p>
@@ -59537,58 +59213,6 @@
         <w:pStyle w:val="Heading2"/>
       </w:pPr>
       <w:r>
-        <w:t>TDA Responsibilities</w:t>
-      </w:r>
-    </w:p>
-    <w:p>
-      <w:pPr>
-        <w:pStyle w:val="ListParagraph"/>
-      </w:pPr>
-      <w:r>
-        <w:t xml:space="preserve">• </w:t>
-      </w:r>
-      <w:r>
-        <w:t>Architecture review and approval</w:t>
-      </w:r>
-    </w:p>
-    <w:p>
-      <w:pPr>
-        <w:pStyle w:val="ListParagraph"/>
-      </w:pPr>
-      <w:r>
-        <w:t xml:space="preserve">• </w:t>
-      </w:r>
-      <w:r>
-        <w:t>Standards compliance oversight</w:t>
-      </w:r>
-    </w:p>
-    <w:p>
-      <w:pPr>
-        <w:pStyle w:val="ListParagraph"/>
-      </w:pPr>
-      <w:r>
-        <w:t xml:space="preserve">• </w:t>
-      </w:r>
-      <w:r>
-        <w:t>Design authority for technical decisions</w:t>
-      </w:r>
-    </w:p>
-    <w:p>
-      <w:pPr>
-        <w:pStyle w:val="ListParagraph"/>
-      </w:pPr>
-      <w:r>
-        <w:t xml:space="preserve">• </w:t>
-      </w:r>
-      <w:r>
-        <w:t>Escalation point for architectural conflicts</w:t>
-      </w:r>
-    </w:p>
-    <w:p>
-      <w:pPr>
-        <w:pStyle w:val="Heading2"/>
-      </w:pPr>
-      <w:r>
         <w:t>Reporting</w:t>
       </w:r>
     </w:p>
@@ -59623,14 +59247,6 @@
       </w:r>
       <w:r>
         <w:t>Progress against roadmap</w:t>
-      </w:r>
-    </w:p>
-    <w:p>
-      <w:pPr>
-        <w:pStyle w:val="Heading2"/>
-      </w:pPr>
-      <w:r>
-        <w:t>Compliance</w:t>
       </w:r>
     </w:p>
     <w:p>
@@ -59909,22 +59525,6 @@
     <w:p>
       <w:pPr>
         <w:pStyle w:val="Heading1"/>
-      </w:pPr>
-      <w:r>
-        <w:t>Glossary</w:t>
-      </w:r>
-    </w:p>
-    <w:p>
-      <w:pPr>
-        <w:pStyle w:val="Heading2"/>
-      </w:pPr>
-      <w:r>
-        <w:t>Glossary</w:t>
-      </w:r>
-    </w:p>
-    <w:p>
-      <w:pPr>
-        <w:pStyle w:val="Heading2"/>
       </w:pPr>
       <w:r>
         <w:t>Glossary</w:t>

</xml_diff>

<commit_message>
vault backup: 2026-09-03 15:03:02
</commit_message>
<xml_diff>
--- a/POC-EuroCRM-Vault/outputs/EuroCRM_Solution_Overview_Document.docx
+++ b/POC-EuroCRM-Vault/outputs/EuroCRM_Solution_Overview_Document.docx
@@ -3107,6 +3107,11 @@
     </w:p>
     <w:p>
       <w:r>
+        <w:t>The document covers the offices in France, Germany, Spain and Poland, and is referred to in several places as Europe. Future phases, currently unplanned, will move this application across other European countries such as Belgium, Norway etc...</w:t>
+      </w:r>
+    </w:p>
+    <w:p>
+      <w:r>
         <w:t xml:space="preserve">The business scope is to create a </w:t>
       </w:r>
       <w:r>
@@ -3124,7 +3129,7 @@
         <w:pStyle w:val="ListParagraph"/>
       </w:pPr>
       <w:r>
-        <w:t>• Create a single, trusted view of clients, contacts, properties and opportunities</w:t>
+        <w:t>• Create a single, trusted view of European clients, contacts, properties and opportunities that are used by the French, German, Spanish and Polish markets</w:t>
       </w:r>
     </w:p>
     <w:p>
@@ -3204,6 +3209,7 @@
         <w:pStyle w:val="ListParagraph"/>
       </w:pPr>
       <w:r>
+        <w:lastRenderedPageBreak/>
         <w:t>• Client knowledge sits with individual brokers in email, Excel trackers, and shared folders</w:t>
       </w:r>
     </w:p>
@@ -3220,8 +3226,12 @@
         <w:pStyle w:val="Heading2"/>
       </w:pPr>
       <w:r>
-        <w:lastRenderedPageBreak/>
         <w:t>Problem Statement</w:t>
+      </w:r>
+    </w:p>
+    <w:p>
+      <w:r>
+        <w:t>See problem statement for detailed analysis.</w:t>
       </w:r>
     </w:p>
     <w:p>
@@ -3528,6 +3538,7 @@
         <w:pStyle w:val="ListParagraph"/>
       </w:pPr>
       <w:r>
+        <w:lastRenderedPageBreak/>
         <w:t>• Regulatory compliance across jurisdictions</w:t>
       </w:r>
     </w:p>
@@ -3552,7 +3563,6 @@
         <w:pStyle w:val="Heading2"/>
       </w:pPr>
       <w:r>
-        <w:lastRenderedPageBreak/>
         <w:t>Constraints</w:t>
       </w:r>
     </w:p>
@@ -6264,7 +6274,7 @@
           <w:noProof/>
         </w:rPr>
         <w:drawing>
-          <wp:inline distT="0" distB="0" distL="0" distR="0" wp14:anchorId="35BCD7A3" wp14:editId="28A969FF">
+          <wp:inline distT="0" distB="0" distL="0" distR="0" wp14:anchorId="551A16EA" wp14:editId="64EDFE6D">
             <wp:extent cx="5760720" cy="1997938"/>
             <wp:effectExtent l="0" t="0" r="0" b="0"/>
             <wp:docPr id="1" name="Picture 1"/>
@@ -7369,6 +7379,14 @@
         <w:pStyle w:val="Heading2"/>
       </w:pPr>
       <w:r>
+        <w:t>KPIs and Success Metrics</w:t>
+      </w:r>
+    </w:p>
+    <w:p>
+      <w:pPr>
+        <w:pStyle w:val="Heading2"/>
+      </w:pPr>
+      <w:r>
         <w:t>Key Performance Indicators</w:t>
       </w:r>
     </w:p>
@@ -9337,6 +9355,14 @@
         <w:pStyle w:val="Heading2"/>
       </w:pPr>
       <w:r>
+        <w:t>Solution Scope — In-Scope</w:t>
+      </w:r>
+    </w:p>
+    <w:p>
+      <w:pPr>
+        <w:pStyle w:val="Heading2"/>
+      </w:pPr>
+      <w:r>
         <w:t>In-Scope Items</w:t>
       </w:r>
     </w:p>
@@ -9810,6 +9836,7 @@
           </w:tcPr>
           <w:p>
             <w:r>
+              <w:lastRenderedPageBreak/>
               <w:t>kf_Deal</w:t>
             </w:r>
           </w:p>
@@ -9845,7 +9872,6 @@
           </w:tcPr>
           <w:p>
             <w:r>
-              <w:lastRenderedPageBreak/>
               <w:t>kf_DealProperty</w:t>
             </w:r>
           </w:p>
@@ -11379,6 +11405,14 @@
         <w:pStyle w:val="Heading2"/>
       </w:pPr>
       <w:r>
+        <w:t>Solution Scope — Out-of-Scope</w:t>
+      </w:r>
+    </w:p>
+    <w:p>
+      <w:pPr>
+        <w:pStyle w:val="Heading2"/>
+      </w:pPr>
+      <w:r>
         <w:t>Out-of-Scope Items</w:t>
       </w:r>
     </w:p>
@@ -11587,6 +11621,7 @@
         <w:pStyle w:val="ListParagraph"/>
       </w:pPr>
       <w:r>
+        <w:lastRenderedPageBreak/>
         <w:t>• Archival of legacy data</w:t>
       </w:r>
     </w:p>
@@ -11595,7 +11630,6 @@
         <w:pStyle w:val="Heading3"/>
       </w:pPr>
       <w:r>
-        <w:lastRenderedPageBreak/>
         <w:t>Security</w:t>
       </w:r>
     </w:p>
@@ -12057,6 +12091,7 @@
         <w:pStyle w:val="Heading2"/>
       </w:pPr>
       <w:r>
+        <w:lastRenderedPageBreak/>
         <w:t>Related Documents</w:t>
       </w:r>
     </w:p>
@@ -12081,192 +12116,192 @@
         <w:pStyle w:val="ListParagraph"/>
       </w:pPr>
       <w:r>
+        <w:t>• dependencies and constraints — Dependencies and constraints</w:t>
+      </w:r>
+    </w:p>
+    <w:p>
+      <w:pPr>
+        <w:pStyle w:val="Heading2"/>
+      </w:pPr>
+      <w:r>
+        <w:t>CRM Lite — MVP Scope</w:t>
+      </w:r>
+    </w:p>
+    <w:p>
+      <w:pPr>
+        <w:pStyle w:val="Heading2"/>
+      </w:pPr>
+      <w:r>
+        <w:t>Key Principle</w:t>
+      </w:r>
+    </w:p>
+    <w:p>
+      <w:r>
+        <w:t>"The MVP is a shared client, contact, property and engagement foundation: a relationship and intelligence layer; not a full operational workflow system — which belongs to the Service Line deep build phase. Capital Markets is the first deeper workflow built on top."</w:t>
+      </w:r>
+    </w:p>
+    <w:p>
+      <w:pPr>
+        <w:pStyle w:val="Heading2"/>
+      </w:pPr>
+      <w:r>
+        <w:t>Shared Foundation</w:t>
+      </w:r>
+    </w:p>
+    <w:p>
+      <w:r>
+        <w:t>Designed to be reusable across service lines and countries:</w:t>
+      </w:r>
+    </w:p>
+    <w:p>
+      <w:pPr>
+        <w:pStyle w:val="ListParagraph"/>
+      </w:pPr>
+      <w:r>
+        <w:t>• Accounts; Contacts; Properties; Engagement Tracking; Security</w:t>
+      </w:r>
+    </w:p>
+    <w:p>
+      <w:pPr>
+        <w:pStyle w:val="ListParagraph"/>
+      </w:pPr>
+      <w:r>
+        <w:t>• Single Client Record</w:t>
+      </w:r>
+    </w:p>
+    <w:p>
+      <w:pPr>
+        <w:pStyle w:val="ListParagraph"/>
+      </w:pPr>
+      <w:r>
+        <w:t>• Cross-SL Contact Intelligence</w:t>
+      </w:r>
+    </w:p>
+    <w:p>
+      <w:pPr>
+        <w:pStyle w:val="ListParagraph"/>
+      </w:pPr>
+      <w:r>
+        <w:t>• Shared Property Records</w:t>
+      </w:r>
+    </w:p>
+    <w:p>
+      <w:pPr>
+        <w:pStyle w:val="ListParagraph"/>
+      </w:pPr>
+      <w:r>
+        <w:t>• Outlook Integration</w:t>
+      </w:r>
+    </w:p>
+    <w:p>
+      <w:pPr>
+        <w:pStyle w:val="ListParagraph"/>
+      </w:pPr>
+      <w:r>
+        <w:t>• SharePoint Auto-Provision</w:t>
+      </w:r>
+    </w:p>
+    <w:p>
+      <w:pPr>
+        <w:pStyle w:val="ListParagraph"/>
+      </w:pPr>
+      <w:r>
+        <w:t>• Power BI Dashboards</w:t>
+      </w:r>
+    </w:p>
+    <w:p>
+      <w:pPr>
+        <w:pStyle w:val="ListParagraph"/>
+      </w:pPr>
+      <w:r>
+        <w:t>• RBAC / Business Units</w:t>
+      </w:r>
+    </w:p>
+    <w:p>
+      <w:pPr>
+        <w:pStyle w:val="ListParagraph"/>
+      </w:pPr>
+      <w:r>
+        <w:t>• Engagement History</w:t>
+      </w:r>
+    </w:p>
+    <w:p>
+      <w:r>
+        <w:t>Core question answered: "Who is this client to Knight Frank across every service line, every country?"</w:t>
+      </w:r>
+    </w:p>
+    <w:p>
+      <w:pPr>
+        <w:pStyle w:val="Heading2"/>
+      </w:pPr>
+      <w:r>
+        <w:t>First Service-Line Build</w:t>
+      </w:r>
+    </w:p>
+    <w:p>
+      <w:r>
+        <w:t>Capital Markets is the first vertical deployed on the shared foundation.</w:t>
+      </w:r>
+    </w:p>
+    <w:p>
+      <w:r>
+        <w:t>OSS, Valuations, etc. follow as separate Service Line solutions on the same backbone.</w:t>
+      </w:r>
+    </w:p>
+    <w:p>
+      <w:pPr>
+        <w:pStyle w:val="Heading2"/>
+      </w:pPr>
+      <w:r>
+        <w:t>Core Master Data Requirements</w:t>
+      </w:r>
+    </w:p>
+    <w:p>
+      <w:pPr>
+        <w:pStyle w:val="ListParagraph"/>
+      </w:pPr>
+      <w:r>
+        <w:t>• Single trusted view of property and clients across service lines and countries</w:t>
+      </w:r>
+    </w:p>
+    <w:p>
+      <w:pPr>
+        <w:pStyle w:val="ListParagraph"/>
+      </w:pPr>
+      <w:r>
+        <w:t>• International standards for property and client type definitions</w:t>
+      </w:r>
+    </w:p>
+    <w:p>
+      <w:pPr>
+        <w:pStyle w:val="Heading2"/>
+      </w:pPr>
+      <w:r>
+        <w:t>Pipeline &amp; Relationships Requirements</w:t>
+      </w:r>
+    </w:p>
+    <w:p>
+      <w:pPr>
+        <w:pStyle w:val="ListParagraph"/>
+      </w:pPr>
+      <w:r>
+        <w:t>• Engagement tracking and cross-border unified client view</w:t>
+      </w:r>
+    </w:p>
+    <w:p>
+      <w:pPr>
+        <w:pStyle w:val="ListParagraph"/>
+      </w:pPr>
+      <w:r>
+        <w:t>• Full pipeline visibility with built-in WIP data</w:t>
+      </w:r>
+    </w:p>
+    <w:p>
+      <w:pPr>
+        <w:pStyle w:val="Heading2"/>
+      </w:pPr>
+      <w:r>
         <w:lastRenderedPageBreak/>
-        <w:t>• dependencies and constraints — Dependencies and constraints</w:t>
-      </w:r>
-    </w:p>
-    <w:p>
-      <w:pPr>
-        <w:pStyle w:val="Heading2"/>
-      </w:pPr>
-      <w:r>
-        <w:t>CRM Lite — MVP Scope</w:t>
-      </w:r>
-    </w:p>
-    <w:p>
-      <w:pPr>
-        <w:pStyle w:val="Heading2"/>
-      </w:pPr>
-      <w:r>
-        <w:t>Key Principle</w:t>
-      </w:r>
-    </w:p>
-    <w:p>
-      <w:r>
-        <w:t>"The MVP is a shared client, contact, property and engagement foundation: a relationship and intelligence layer; not a full operational workflow system — which belongs to the Service Line deep build phase. Capital Markets is the first deeper workflow built on top."</w:t>
-      </w:r>
-    </w:p>
-    <w:p>
-      <w:pPr>
-        <w:pStyle w:val="Heading2"/>
-      </w:pPr>
-      <w:r>
-        <w:t>Shared Foundation</w:t>
-      </w:r>
-    </w:p>
-    <w:p>
-      <w:r>
-        <w:t>Designed to be reusable across service lines and countries:</w:t>
-      </w:r>
-    </w:p>
-    <w:p>
-      <w:pPr>
-        <w:pStyle w:val="ListParagraph"/>
-      </w:pPr>
-      <w:r>
-        <w:t>• Accounts; Contacts; Properties; Engagement Tracking; Security</w:t>
-      </w:r>
-    </w:p>
-    <w:p>
-      <w:pPr>
-        <w:pStyle w:val="ListParagraph"/>
-      </w:pPr>
-      <w:r>
-        <w:t>• Single Client Record</w:t>
-      </w:r>
-    </w:p>
-    <w:p>
-      <w:pPr>
-        <w:pStyle w:val="ListParagraph"/>
-      </w:pPr>
-      <w:r>
-        <w:t>• Cross-SL Contact Intelligence</w:t>
-      </w:r>
-    </w:p>
-    <w:p>
-      <w:pPr>
-        <w:pStyle w:val="ListParagraph"/>
-      </w:pPr>
-      <w:r>
-        <w:t>• Shared Property Records</w:t>
-      </w:r>
-    </w:p>
-    <w:p>
-      <w:pPr>
-        <w:pStyle w:val="ListParagraph"/>
-      </w:pPr>
-      <w:r>
-        <w:t>• Outlook Integration</w:t>
-      </w:r>
-    </w:p>
-    <w:p>
-      <w:pPr>
-        <w:pStyle w:val="ListParagraph"/>
-      </w:pPr>
-      <w:r>
-        <w:t>• SharePoint Auto-Provision</w:t>
-      </w:r>
-    </w:p>
-    <w:p>
-      <w:pPr>
-        <w:pStyle w:val="ListParagraph"/>
-      </w:pPr>
-      <w:r>
-        <w:t>• Power BI Dashboards</w:t>
-      </w:r>
-    </w:p>
-    <w:p>
-      <w:pPr>
-        <w:pStyle w:val="ListParagraph"/>
-      </w:pPr>
-      <w:r>
-        <w:t>• RBAC / Business Units</w:t>
-      </w:r>
-    </w:p>
-    <w:p>
-      <w:pPr>
-        <w:pStyle w:val="ListParagraph"/>
-      </w:pPr>
-      <w:r>
-        <w:t>• Engagement History</w:t>
-      </w:r>
-    </w:p>
-    <w:p>
-      <w:r>
-        <w:t>Core question answered: "Who is this client to Knight Frank across every service line, every country?"</w:t>
-      </w:r>
-    </w:p>
-    <w:p>
-      <w:pPr>
-        <w:pStyle w:val="Heading2"/>
-      </w:pPr>
-      <w:r>
-        <w:t>First Service-Line Build</w:t>
-      </w:r>
-    </w:p>
-    <w:p>
-      <w:r>
-        <w:t>Capital Markets is the first vertical deployed on the shared foundation.</w:t>
-      </w:r>
-    </w:p>
-    <w:p>
-      <w:r>
-        <w:t>OSS, Valuations, etc. follow as separate Service Line solutions on the same backbone.</w:t>
-      </w:r>
-    </w:p>
-    <w:p>
-      <w:pPr>
-        <w:pStyle w:val="Heading2"/>
-      </w:pPr>
-      <w:r>
-        <w:t>Core Master Data Requirements</w:t>
-      </w:r>
-    </w:p>
-    <w:p>
-      <w:pPr>
-        <w:pStyle w:val="ListParagraph"/>
-      </w:pPr>
-      <w:r>
-        <w:t>• Single trusted view of property and clients across service lines and countries</w:t>
-      </w:r>
-    </w:p>
-    <w:p>
-      <w:pPr>
-        <w:pStyle w:val="ListParagraph"/>
-      </w:pPr>
-      <w:r>
-        <w:t>• International standards for property and client type definitions</w:t>
-      </w:r>
-    </w:p>
-    <w:p>
-      <w:pPr>
-        <w:pStyle w:val="Heading2"/>
-      </w:pPr>
-      <w:r>
-        <w:t>Pipeline &amp; Relationships Requirements</w:t>
-      </w:r>
-    </w:p>
-    <w:p>
-      <w:pPr>
-        <w:pStyle w:val="ListParagraph"/>
-      </w:pPr>
-      <w:r>
-        <w:t>• Engagement tracking and cross-border unified client view</w:t>
-      </w:r>
-    </w:p>
-    <w:p>
-      <w:pPr>
-        <w:pStyle w:val="ListParagraph"/>
-      </w:pPr>
-      <w:r>
-        <w:t>• Full pipeline visibility with built-in WIP data</w:t>
-      </w:r>
-    </w:p>
-    <w:p>
-      <w:pPr>
-        <w:pStyle w:val="Heading2"/>
-      </w:pPr>
-      <w:r>
         <w:t>Productivity Tools Requirements</w:t>
       </w:r>
     </w:p>
@@ -12291,7 +12326,6 @@
         <w:pStyle w:val="ListParagraph"/>
       </w:pPr>
       <w:r>
-        <w:lastRenderedPageBreak/>
         <w:t>• Power BI dashboards</w:t>
       </w:r>
     </w:p>
@@ -12403,7 +12437,7 @@
           <w:noProof/>
         </w:rPr>
         <w:drawing>
-          <wp:inline distT="0" distB="0" distL="0" distR="0" wp14:anchorId="0654370E" wp14:editId="67D0B846">
+          <wp:inline distT="0" distB="0" distL="0" distR="0" wp14:anchorId="19467943" wp14:editId="3FA6B4C4">
             <wp:extent cx="5760720" cy="4813909"/>
             <wp:effectExtent l="0" t="0" r="0" b="0"/>
             <wp:docPr id="2" name="Picture 2"/>
@@ -12462,7 +12496,7 @@
         </w:rPr>
         <w:lastRenderedPageBreak/>
         <w:drawing>
-          <wp:inline distT="0" distB="0" distL="0" distR="0" wp14:anchorId="4D3A4B5E" wp14:editId="506A2B3E">
+          <wp:inline distT="0" distB="0" distL="0" distR="0" wp14:anchorId="79718A3B" wp14:editId="13D10122">
             <wp:extent cx="5760720" cy="2560990"/>
             <wp:effectExtent l="0" t="0" r="0" b="0"/>
             <wp:docPr id="3" name="Picture 3"/>
@@ -12520,7 +12554,7 @@
           <w:noProof/>
         </w:rPr>
         <w:drawing>
-          <wp:inline distT="0" distB="0" distL="0" distR="0" wp14:anchorId="1409B80D" wp14:editId="53E68BFC">
+          <wp:inline distT="0" distB="0" distL="0" distR="0" wp14:anchorId="54252707" wp14:editId="305721CB">
             <wp:extent cx="5760720" cy="3207405"/>
             <wp:effectExtent l="0" t="0" r="0" b="0"/>
             <wp:docPr id="4" name="Picture 4"/>
@@ -12561,6 +12595,65 @@
         <w:pStyle w:val="Heading2"/>
       </w:pPr>
       <w:r>
+        <w:t>Diagram Sources</w:t>
+      </w:r>
+    </w:p>
+    <w:p>
+      <w:pPr>
+        <w:pStyle w:val="ListParagraph"/>
+      </w:pPr>
+      <w:r>
+        <w:t xml:space="preserve">• </w:t>
+      </w:r>
+      <w:r>
+        <w:rPr>
+          <w:rFonts w:ascii="Consolas" w:hAnsi="Consolas"/>
+        </w:rPr>
+        <w:t>wiki/architecture-diagram.puml</w:t>
+      </w:r>
+      <w:r>
+        <w:t xml:space="preserve"> — Full solution architecture</w:t>
+      </w:r>
+    </w:p>
+    <w:p>
+      <w:pPr>
+        <w:pStyle w:val="ListParagraph"/>
+      </w:pPr>
+      <w:r>
+        <w:t xml:space="preserve">• </w:t>
+      </w:r>
+      <w:r>
+        <w:rPr>
+          <w:rFonts w:ascii="Consolas" w:hAnsi="Consolas"/>
+        </w:rPr>
+        <w:t>wiki/architecture-layers.puml</w:t>
+      </w:r>
+      <w:r>
+        <w:t xml:space="preserve"> — Layered model</w:t>
+      </w:r>
+    </w:p>
+    <w:p>
+      <w:pPr>
+        <w:pStyle w:val="ListParagraph"/>
+      </w:pPr>
+      <w:r>
+        <w:t xml:space="preserve">• </w:t>
+      </w:r>
+      <w:r>
+        <w:rPr>
+          <w:rFonts w:ascii="Consolas" w:hAnsi="Consolas"/>
+        </w:rPr>
+        <w:t>wiki/architecture-dataflow.puml</w:t>
+      </w:r>
+      <w:r>
+        <w:t xml:space="preserve"> — Data flow and integrations</w:t>
+      </w:r>
+    </w:p>
+    <w:p>
+      <w:pPr>
+        <w:pStyle w:val="Heading2"/>
+      </w:pPr>
+      <w:r>
         <w:t>Status</w:t>
       </w:r>
     </w:p>
@@ -12574,6 +12667,7 @@
         <w:pStyle w:val="Heading2"/>
       </w:pPr>
       <w:r>
+        <w:lastRenderedPageBreak/>
         <w:t>Architecture — Key Components</w:t>
       </w:r>
     </w:p>
@@ -12598,7 +12692,6 @@
     </w:p>
     <w:p>
       <w:r>
-        <w:lastRenderedPageBreak/>
         <w:t>See power apps rationale for detailed analysis.</w:t>
       </w:r>
     </w:p>
@@ -12884,6 +12977,7 @@
         <w:pStyle w:val="ListParagraph"/>
       </w:pPr>
       <w:r>
+        <w:lastRenderedPageBreak/>
         <w:t xml:space="preserve">• </w:t>
       </w:r>
       <w:r>
@@ -13009,7 +13103,6 @@
           </w:tcPr>
           <w:p>
             <w:r>
-              <w:lastRenderedPageBreak/>
               <w:t>Capital Markets</w:t>
             </w:r>
           </w:p>
@@ -13425,6 +13518,7 @@
         <w:pStyle w:val="Heading3"/>
       </w:pPr>
       <w:r>
+        <w:lastRenderedPageBreak/>
         <w:t>Property Domain</w:t>
       </w:r>
     </w:p>
@@ -13575,7 +13669,6 @@
         <w:pStyle w:val="Heading3"/>
       </w:pPr>
       <w:r>
-        <w:lastRenderedPageBreak/>
         <w:t>Deal Domain (Capital Markets)</w:t>
       </w:r>
     </w:p>
@@ -14094,6 +14187,7 @@
           </w:tcPr>
           <w:p>
             <w:r>
+              <w:lastRenderedPageBreak/>
               <w:t>Power Automate</w:t>
             </w:r>
           </w:p>
@@ -14234,7 +14328,6 @@
           </w:tcPr>
           <w:p>
             <w:r>
-              <w:lastRenderedPageBreak/>
               <w:t>Loqate</w:t>
             </w:r>
           </w:p>
@@ -14245,9 +14338,6 @@
           </w:tcPr>
           <w:p>
             <w:r>
-              <w:t xml:space="preserve">D365 / </w:t>
-            </w:r>
-            <w:r>
               <w:t>Dataverse</w:t>
             </w:r>
           </w:p>
@@ -14283,9 +14373,6 @@
           </w:tcPr>
           <w:p>
             <w:r>
-              <w:t xml:space="preserve">D365 / </w:t>
-            </w:r>
-            <w:r>
               <w:t>Dataverse</w:t>
             </w:r>
           </w:p>
@@ -14320,9 +14407,6 @@
             <w:tcW w:w="3009" w:type="dxa"/>
           </w:tcPr>
           <w:p>
-            <w:r>
-              <w:t xml:space="preserve">D365 / </w:t>
-            </w:r>
             <w:r>
               <w:t>Dataverse</w:t>
             </w:r>
@@ -14507,6 +14591,7 @@
         <w:pStyle w:val="ListParagraph"/>
       </w:pPr>
       <w:r>
+        <w:lastRenderedPageBreak/>
         <w:t>• wip data model — WIP and Finance integration</w:t>
       </w:r>
     </w:p>
@@ -14552,7 +14637,6 @@
         <w:pStyle w:val="ListParagraph"/>
       </w:pPr>
       <w:r>
-        <w:lastRenderedPageBreak/>
         <w:t xml:space="preserve">1. </w:t>
       </w:r>
       <w:r>
@@ -14972,6 +15056,7 @@
           </w:tcPr>
           <w:p>
             <w:r>
+              <w:lastRenderedPageBreak/>
               <w:t>Address Validation</w:t>
             </w:r>
           </w:p>
@@ -15106,7 +15191,6 @@
           </w:tcPr>
           <w:p>
             <w:r>
-              <w:lastRenderedPageBreak/>
               <w:t>Pitch Tracking</w:t>
             </w:r>
           </w:p>
@@ -15482,6 +15566,7 @@
         <w:pStyle w:val="Heading3"/>
       </w:pPr>
       <w:r>
+        <w:lastRenderedPageBreak/>
         <w:t>Finance &amp; Reporting</w:t>
       </w:r>
     </w:p>
@@ -15686,7 +15771,6 @@
         <w:pStyle w:val="Heading2"/>
       </w:pPr>
       <w:r>
-        <w:lastRenderedPageBreak/>
         <w:t>Business Process Flows</w:t>
       </w:r>
     </w:p>
@@ -15707,7 +15791,7 @@
           <w:noProof/>
         </w:rPr>
         <w:drawing>
-          <wp:inline distT="0" distB="0" distL="0" distR="0" wp14:anchorId="4E952467" wp14:editId="4AA265CC">
+          <wp:inline distT="0" distB="0" distL="0" distR="0" wp14:anchorId="19B831F4" wp14:editId="4A6122E0">
             <wp:extent cx="5760720" cy="237255"/>
             <wp:effectExtent l="0" t="0" r="0" b="0"/>
             <wp:docPr id="5" name="Picture 5"/>
@@ -15884,6 +15968,7 @@
         <w:pStyle w:val="Heading3"/>
       </w:pPr>
       <w:r>
+        <w:lastRenderedPageBreak/>
         <w:t>Property Registration</w:t>
       </w:r>
     </w:p>
@@ -16020,7 +16105,6 @@
           </w:tcPr>
           <w:p>
             <w:r>
-              <w:lastRenderedPageBreak/>
               <w:t>L3 (Region)</w:t>
             </w:r>
           </w:p>
@@ -16404,6 +16488,7 @@
           </w:tcPr>
           <w:p>
             <w:r>
+              <w:lastRenderedPageBreak/>
               <w:t>Property Management</w:t>
             </w:r>
           </w:p>
@@ -16629,7 +16714,6 @@
           </w:tcPr>
           <w:p>
             <w:r>
-              <w:lastRenderedPageBreak/>
               <w:t>Investor Advisory</w:t>
             </w:r>
           </w:p>
@@ -16852,6 +16936,7 @@
         <w:pStyle w:val="Heading2"/>
       </w:pPr>
       <w:r>
+        <w:lastRenderedPageBreak/>
         <w:t>Platform Selection Rationale</w:t>
       </w:r>
     </w:p>
@@ -17034,7 +17119,6 @@
         <w:pStyle w:val="ListParagraph"/>
       </w:pPr>
       <w:r>
-        <w:lastRenderedPageBreak/>
         <w:t>• Security roles + Business Units enable country/service-line isolation</w:t>
       </w:r>
     </w:p>
@@ -17355,6 +17439,7 @@
           </w:tcPr>
           <w:p>
             <w:r>
+              <w:lastRenderedPageBreak/>
               <w:t>Capital Markets Deal</w:t>
             </w:r>
           </w:p>
@@ -17526,7 +17611,6 @@
         <w:pStyle w:val="Heading3"/>
       </w:pPr>
       <w:r>
-        <w:lastRenderedPageBreak/>
         <w:t>3. Forms and Views</w:t>
       </w:r>
     </w:p>
@@ -17875,6 +17959,7 @@
           </w:tcPr>
           <w:p>
             <w:r>
+              <w:lastRenderedPageBreak/>
               <w:t>WIP Aging</w:t>
             </w:r>
           </w:p>
@@ -18186,7 +18271,6 @@
           </w:tcPr>
           <w:p>
             <w:r>
-              <w:lastRenderedPageBreak/>
               <w:t>Power Automate</w:t>
             </w:r>
           </w:p>
@@ -18518,6 +18602,7 @@
         <w:pStyle w:val="ListParagraph"/>
       </w:pPr>
       <w:r>
+        <w:lastRenderedPageBreak/>
         <w:t xml:space="preserve">• </w:t>
       </w:r>
       <w:r>
@@ -18769,7 +18854,6 @@
           </w:tcPr>
           <w:p>
             <w:r>
-              <w:lastRenderedPageBreak/>
               <w:t>Flow 5</w:t>
             </w:r>
           </w:p>
@@ -19190,6 +19274,7 @@
           </w:tcPr>
           <w:p>
             <w:r>
+              <w:lastRenderedPageBreak/>
               <w:t>CM Manager</w:t>
             </w:r>
           </w:p>
@@ -19429,7 +19514,6 @@
           </w:tcPr>
           <w:p>
             <w:r>
-              <w:lastRenderedPageBreak/>
               <w:t>Create deal</w:t>
             </w:r>
           </w:p>
@@ -19892,6 +19976,7 @@
           </w:tcPr>
           <w:p>
             <w:r>
+              <w:lastRenderedPageBreak/>
               <w:t>KF_Spain</w:t>
             </w:r>
           </w:p>
@@ -20166,7 +20251,6 @@
           </w:tcPr>
           <w:p>
             <w:r>
-              <w:lastRenderedPageBreak/>
               <w:t>TEST</w:t>
             </w:r>
           </w:p>
@@ -20401,6 +20485,7 @@
         <w:pStyle w:val="Heading2"/>
       </w:pPr>
       <w:r>
+        <w:lastRenderedPageBreak/>
         <w:t>Architecture — Data</w:t>
       </w:r>
     </w:p>
@@ -20588,7 +20673,6 @@
           </w:tcPr>
           <w:p>
             <w:r>
-              <w:lastRenderedPageBreak/>
               <w:t>kf_InvestorProfile</w:t>
             </w:r>
           </w:p>
@@ -20885,6 +20969,7 @@
           </w:tcPr>
           <w:p>
             <w:r>
+              <w:lastRenderedPageBreak/>
               <w:t>kf_DealProperty</w:t>
             </w:r>
           </w:p>
@@ -21055,7 +21140,6 @@
         <w:pStyle w:val="Heading3"/>
       </w:pPr>
       <w:r>
-        <w:lastRenderedPageBreak/>
         <w:t>3. Deal Domain (Capital Markets)</w:t>
       </w:r>
     </w:p>
@@ -21373,6 +21457,7 @@
         <w:pStyle w:val="ListParagraph"/>
       </w:pPr>
       <w:r>
+        <w:lastRenderedPageBreak/>
         <w:t>• Regulatory gates fire automatically per market (France: pre-emption; Spain: right-of-refusal)</w:t>
       </w:r>
     </w:p>
@@ -21605,7 +21690,6 @@
           </w:tcPr>
           <w:p>
             <w:r>
-              <w:lastRenderedPageBreak/>
               <w:t>kf_AuditExport</w:t>
             </w:r>
           </w:p>
@@ -21905,6 +21989,7 @@
           </w:tcPr>
           <w:p>
             <w:r>
+              <w:lastRenderedPageBreak/>
               <w:t>kf_IntegrationLog</w:t>
             </w:r>
           </w:p>
@@ -22130,7 +22215,6 @@
           </w:tcPr>
           <w:p>
             <w:r>
-              <w:lastRenderedPageBreak/>
               <w:t>kf_EnergyRating</w:t>
             </w:r>
           </w:p>
@@ -22374,6 +22458,7 @@
           </w:tcPr>
           <w:p>
             <w:r>
+              <w:lastRenderedPageBreak/>
               <w:t>Audit</w:t>
             </w:r>
           </w:p>
@@ -22481,7 +22566,6 @@
         <w:rPr>
           <w:b/>
         </w:rPr>
-        <w:lastRenderedPageBreak/>
         <w:t>Strategic Sectors:</w:t>
       </w:r>
       <w:r>
@@ -22724,6 +22808,7 @@
         <w:pStyle w:val="Heading2"/>
       </w:pPr>
       <w:r>
+        <w:lastRenderedPageBreak/>
         <w:t>Data Quality</w:t>
       </w:r>
     </w:p>
@@ -23028,7 +23113,6 @@
           </w:tcPr>
           <w:p>
             <w:r>
-              <w:lastRenderedPageBreak/>
               <w:t>Service lines</w:t>
             </w:r>
           </w:p>
@@ -23178,6 +23262,7 @@
         <w:pStyle w:val="Heading2"/>
       </w:pPr>
       <w:r>
+        <w:lastRenderedPageBreak/>
         <w:t>Infrastructure</w:t>
       </w:r>
     </w:p>
@@ -23666,7 +23751,6 @@
           </w:tcPr>
           <w:p>
             <w:r>
-              <w:lastRenderedPageBreak/>
               <w:t>UAT</w:t>
             </w:r>
           </w:p>
@@ -23934,6 +24018,7 @@
           </w:tcPr>
           <w:p>
             <w:r>
+              <w:lastRenderedPageBreak/>
               <w:t>Reporting</w:t>
             </w:r>
           </w:p>
@@ -24309,7 +24394,6 @@
         <w:rPr>
           <w:b/>
         </w:rPr>
-        <w:lastRenderedPageBreak/>
         <w:t>Note:</w:t>
       </w:r>
       <w:r>
@@ -24560,6 +24644,7 @@
         <w:pStyle w:val="Heading2"/>
       </w:pPr>
       <w:r>
+        <w:lastRenderedPageBreak/>
         <w:t>Security Architecture</w:t>
       </w:r>
     </w:p>
@@ -24930,7 +25015,6 @@
           </w:tcPr>
           <w:p>
             <w:r>
-              <w:lastRenderedPageBreak/>
               <w:t>At Rest</w:t>
             </w:r>
           </w:p>
@@ -25195,6 +25279,7 @@
           </w:tcPr>
           <w:p>
             <w:r>
+              <w:lastRenderedPageBreak/>
               <w:t>Concurrent Users</w:t>
             </w:r>
           </w:p>
@@ -25610,7 +25695,6 @@
           </w:tcPr>
           <w:p>
             <w:r>
-              <w:lastRenderedPageBreak/>
               <w:t>kf_IntegrationLog</w:t>
             </w:r>
           </w:p>
@@ -25807,6 +25891,7 @@
         <w:pStyle w:val="Heading2"/>
       </w:pPr>
       <w:r>
+        <w:lastRenderedPageBreak/>
         <w:t>Cost Considerations</w:t>
       </w:r>
     </w:p>
@@ -26133,39 +26218,39 @@
         <w:pStyle w:val="ListParagraph"/>
       </w:pPr>
       <w:r>
+        <w:t>• architecture application — Application layer details</w:t>
+      </w:r>
+    </w:p>
+    <w:p>
+      <w:pPr>
+        <w:pStyle w:val="ListParagraph"/>
+      </w:pPr>
+      <w:r>
+        <w:t>• architecture data — Data model details</w:t>
+      </w:r>
+    </w:p>
+    <w:p>
+      <w:pPr>
+        <w:pStyle w:val="ListParagraph"/>
+      </w:pPr>
+      <w:r>
+        <w:t>• solution package model — Layer model</w:t>
+      </w:r>
+    </w:p>
+    <w:p>
+      <w:pPr>
+        <w:pStyle w:val="ListParagraph"/>
+      </w:pPr>
+      <w:r>
+        <w:t>• power apps rationale — Platform selection</w:t>
+      </w:r>
+    </w:p>
+    <w:p>
+      <w:pPr>
+        <w:pStyle w:val="Heading2"/>
+      </w:pPr>
+      <w:r>
         <w:lastRenderedPageBreak/>
-        <w:t>• architecture application — Application layer details</w:t>
-      </w:r>
-    </w:p>
-    <w:p>
-      <w:pPr>
-        <w:pStyle w:val="ListParagraph"/>
-      </w:pPr>
-      <w:r>
-        <w:t>• architecture data — Data model details</w:t>
-      </w:r>
-    </w:p>
-    <w:p>
-      <w:pPr>
-        <w:pStyle w:val="ListParagraph"/>
-      </w:pPr>
-      <w:r>
-        <w:t>• solution package model — Layer model</w:t>
-      </w:r>
-    </w:p>
-    <w:p>
-      <w:pPr>
-        <w:pStyle w:val="ListParagraph"/>
-      </w:pPr>
-      <w:r>
-        <w:t>• power apps rationale — Platform selection</w:t>
-      </w:r>
-    </w:p>
-    <w:p>
-      <w:pPr>
-        <w:pStyle w:val="Heading2"/>
-      </w:pPr>
-      <w:r>
         <w:t>Client Data Model — One Client, One View</w:t>
       </w:r>
     </w:p>
@@ -26186,7 +26271,7 @@
           <w:noProof/>
         </w:rPr>
         <w:drawing>
-          <wp:inline distT="0" distB="0" distL="0" distR="0" wp14:anchorId="53282FE8" wp14:editId="47C2A73B">
+          <wp:inline distT="0" distB="0" distL="0" distR="0" wp14:anchorId="0B83BEEC" wp14:editId="58402B84">
             <wp:extent cx="5760720" cy="4017715"/>
             <wp:effectExtent l="0" t="0" r="0" b="0"/>
             <wp:docPr id="6" name="Picture 6"/>
@@ -26355,7 +26440,6 @@
         <w:pStyle w:val="ListParagraph"/>
       </w:pPr>
       <w:r>
-        <w:lastRenderedPageBreak/>
         <w:t xml:space="preserve">• </w:t>
       </w:r>
       <w:r>
@@ -26400,6 +26484,7 @@
     </w:p>
     <w:p>
       <w:r>
+        <w:lastRenderedPageBreak/>
         <w:t>The individual person, always associated to an Account.</w:t>
       </w:r>
     </w:p>
@@ -26692,36 +26777,36 @@
         <w:pStyle w:val="ListParagraph"/>
       </w:pPr>
       <w:r>
+        <w:t>• Germany: Handelsregister HRB</w:t>
+      </w:r>
+    </w:p>
+    <w:p>
+      <w:pPr>
+        <w:pStyle w:val="ListParagraph"/>
+      </w:pPr>
+      <w:r>
+        <w:t>• Spain: Registro Mercantil</w:t>
+      </w:r>
+    </w:p>
+    <w:p>
+      <w:pPr>
+        <w:pStyle w:val="ListParagraph"/>
+      </w:pPr>
+      <w:r>
+        <w:t>• Poland: KRS number</w:t>
+      </w:r>
+    </w:p>
+    <w:p>
+      <w:r>
+        <w:t>Standard codes make sector reporting comparable across Europe, and a validated registration number underpins KYC and invoicing.</w:t>
+      </w:r>
+    </w:p>
+    <w:p>
+      <w:pPr>
+        <w:pStyle w:val="Heading2"/>
+      </w:pPr>
+      <w:r>
         <w:lastRenderedPageBreak/>
-        <w:t>• Germany: Handelsregister HRB</w:t>
-      </w:r>
-    </w:p>
-    <w:p>
-      <w:pPr>
-        <w:pStyle w:val="ListParagraph"/>
-      </w:pPr>
-      <w:r>
-        <w:t>• Spain: Registro Mercantil</w:t>
-      </w:r>
-    </w:p>
-    <w:p>
-      <w:pPr>
-        <w:pStyle w:val="ListParagraph"/>
-      </w:pPr>
-      <w:r>
-        <w:t>• Poland: KRS number</w:t>
-      </w:r>
-    </w:p>
-    <w:p>
-      <w:r>
-        <w:t>Standard codes make sector reporting comparable across Europe, and a validated registration number underpins KYC and invoicing.</w:t>
-      </w:r>
-    </w:p>
-    <w:p>
-      <w:pPr>
-        <w:pStyle w:val="Heading2"/>
-      </w:pPr>
-      <w:r>
         <w:t>Property Data Model — Site, Property, Deal</w:t>
       </w:r>
     </w:p>
@@ -26742,7 +26827,7 @@
           <w:noProof/>
         </w:rPr>
         <w:drawing>
-          <wp:inline distT="0" distB="0" distL="0" distR="0" wp14:anchorId="11965502" wp14:editId="4F47E7A5">
+          <wp:inline distT="0" distB="0" distL="0" distR="0" wp14:anchorId="30D2413E" wp14:editId="0D1DBCA5">
             <wp:extent cx="5760720" cy="5547360"/>
             <wp:effectExtent l="0" t="0" r="0" b="0"/>
             <wp:docPr id="7" name="Picture 7"/>
@@ -26804,7 +26889,6 @@
         <w:rPr>
           <w:b/>
         </w:rPr>
-        <w:lastRenderedPageBreak/>
         <w:t>Key Fields:</w:t>
       </w:r>
     </w:p>
@@ -26881,6 +26965,7 @@
         <w:pStyle w:val="Heading3"/>
       </w:pPr>
       <w:r>
+        <w:lastRenderedPageBreak/>
         <w:t>Address Storage (Country-Neutral Standard)</w:t>
       </w:r>
     </w:p>
@@ -27419,7 +27504,6 @@
     </w:p>
     <w:p>
       <w:r>
-        <w:lastRenderedPageBreak/>
         <w:t>As with the previous schema, the address is also presented as a single line (</w:t>
       </w:r>
       <w:r>
@@ -27467,7 +27551,11 @@
         <w:t>kf_AddressFormat</w:t>
       </w:r>
       <w:r>
-        <w:t xml:space="preserve">), updated periodically from the Loqate international address formats source. </w:t>
+        <w:t xml:space="preserve">), updated periodically from the Loqate </w:t>
+      </w:r>
+      <w:r>
+        <w:lastRenderedPageBreak/>
+        <w:t xml:space="preserve">international address formats source. </w:t>
       </w:r>
       <w:r>
         <w:rPr>
@@ -27744,7 +27832,6 @@
         <w:pStyle w:val="Heading2"/>
       </w:pPr>
       <w:r>
-        <w:lastRenderedPageBreak/>
         <w:t>Why Two Property Tables?</w:t>
       </w:r>
     </w:p>
@@ -27780,6 +27867,7 @@
         <w:pStyle w:val="ListParagraph"/>
       </w:pPr>
       <w:r>
+        <w:lastRenderedPageBreak/>
         <w:t>• Capital Markets — deals, bids, DD, investors</w:t>
       </w:r>
     </w:p>
@@ -27977,7 +28065,6 @@
     </w:p>
     <w:p>
       <w:r>
-        <w:lastRenderedPageBreak/>
         <w:t xml:space="preserve">Loqate validates and populates the country-neutral address elements above. The addresses it returns conform to the UPU S42a-6 / ISO 19773 standard. The Loqate international address formats are cached in the </w:t>
       </w:r>
       <w:r>
@@ -28004,6 +28091,7 @@
         <w:pStyle w:val="Heading2"/>
       </w:pPr>
       <w:r>
+        <w:lastRenderedPageBreak/>
         <w:t>Every Service Line Reads the Same Record</w:t>
       </w:r>
     </w:p>
@@ -28423,7 +28511,6 @@
         <w:pStyle w:val="Heading2"/>
       </w:pPr>
       <w:r>
-        <w:lastRenderedPageBreak/>
         <w:t>Capital Markets Data Model</w:t>
       </w:r>
     </w:p>
@@ -28444,7 +28531,7 @@
           <w:noProof/>
         </w:rPr>
         <w:drawing>
-          <wp:inline distT="0" distB="0" distL="0" distR="0" wp14:anchorId="148E8E72" wp14:editId="3BFB554D">
+          <wp:inline distT="0" distB="0" distL="0" distR="0" wp14:anchorId="48DAC69B" wp14:editId="0C01F8C9">
             <wp:extent cx="5760720" cy="3059921"/>
             <wp:effectExtent l="0" t="0" r="0" b="0"/>
             <wp:docPr id="8" name="Picture 8"/>
@@ -28485,6 +28572,7 @@
         <w:pStyle w:val="Heading2"/>
       </w:pPr>
       <w:r>
+        <w:lastRenderedPageBreak/>
         <w:t>Core Entities</w:t>
       </w:r>
     </w:p>
@@ -28802,7 +28890,6 @@
           </w:tcPr>
           <w:p>
             <w:r>
-              <w:lastRenderedPageBreak/>
               <w:t>kf_KYCRecord</w:t>
             </w:r>
           </w:p>
@@ -29052,6 +29139,7 @@
         <w:pStyle w:val="ListParagraph"/>
       </w:pPr>
       <w:r>
+        <w:lastRenderedPageBreak/>
         <w:t xml:space="preserve">• </w:t>
       </w:r>
       <w:r>
@@ -29232,7 +29320,6 @@
         <w:pStyle w:val="ListParagraph"/>
       </w:pPr>
       <w:r>
-        <w:lastRenderedPageBreak/>
         <w:t xml:space="preserve">• </w:t>
       </w:r>
       <w:r>
@@ -29369,6 +29456,7 @@
         <w:pStyle w:val="ListParagraph"/>
       </w:pPr>
       <w:r>
+        <w:lastRenderedPageBreak/>
         <w:t>• Strategy: Core / Core-Plus / Value-Add / Opportunistic</w:t>
       </w:r>
     </w:p>
@@ -29533,7 +29621,6 @@
         <w:pStyle w:val="Heading3"/>
       </w:pPr>
       <w:r>
-        <w:lastRenderedPageBreak/>
         <w:t>Eight-Stage Deal Lifecycle with Gates</w:t>
       </w:r>
     </w:p>
@@ -30023,7 +30110,7 @@
           <w:noProof/>
         </w:rPr>
         <w:drawing>
-          <wp:inline distT="0" distB="0" distL="0" distR="0" wp14:anchorId="3404330E" wp14:editId="20276FE3">
+          <wp:inline distT="0" distB="0" distL="0" distR="0" wp14:anchorId="42B1EDA4" wp14:editId="3EF69661">
             <wp:extent cx="5760720" cy="5192965"/>
             <wp:effectExtent l="0" t="0" r="0" b="0"/>
             <wp:docPr id="9" name="Picture 9"/>
@@ -32545,7 +32632,7 @@
           <w:noProof/>
         </w:rPr>
         <w:drawing>
-          <wp:inline distT="0" distB="0" distL="0" distR="0" wp14:anchorId="23FC1C1A" wp14:editId="19CED39C">
+          <wp:inline distT="0" distB="0" distL="0" distR="0" wp14:anchorId="14F3CD00" wp14:editId="680C3098">
             <wp:extent cx="5760720" cy="1845965"/>
             <wp:effectExtent l="0" t="0" r="0" b="0"/>
             <wp:docPr id="10" name="Picture 10"/>
@@ -45698,7 +45785,7 @@
           <w:noProof/>
         </w:rPr>
         <w:drawing>
-          <wp:inline distT="0" distB="0" distL="0" distR="0" wp14:anchorId="2E98CA0F" wp14:editId="368C78BE">
+          <wp:inline distT="0" distB="0" distL="0" distR="0" wp14:anchorId="36B12EE1" wp14:editId="46604AA6">
             <wp:extent cx="5760720" cy="2909497"/>
             <wp:effectExtent l="0" t="0" r="0" b="0"/>
             <wp:docPr id="11" name="Picture 11"/>
@@ -50865,7 +50952,7 @@
           <w:noProof/>
         </w:rPr>
         <w:drawing>
-          <wp:inline distT="0" distB="0" distL="0" distR="0" wp14:anchorId="4600DBF4" wp14:editId="2A02EBB2">
+          <wp:inline distT="0" distB="0" distL="0" distR="0" wp14:anchorId="771CA522" wp14:editId="20F7F999">
             <wp:extent cx="5760720" cy="2813762"/>
             <wp:effectExtent l="0" t="0" r="0" b="0"/>
             <wp:docPr id="12" name="Picture 12"/>
@@ -61617,7 +61704,7 @@
   <w:style w:type="paragraph" w:default="1" w:styleId="Normal">
     <w:name w:val="Normal"/>
     <w:qFormat/>
-    <w:rsid w:val="00220B33"/>
+    <w:rsid w:val="00EB0082"/>
   </w:style>
   <w:style w:type="paragraph" w:styleId="Heading1">
     <w:name w:val="heading 1"/>
@@ -61668,6 +61755,7 @@
     <w:next w:val="Normal"/>
     <w:link w:val="Heading3Char"/>
     <w:uiPriority w:val="9"/>
+    <w:semiHidden/>
     <w:unhideWhenUsed/>
     <w:qFormat/>
     <w:rsid w:val="00F86118"/>
@@ -61874,6 +61962,7 @@
     <w:basedOn w:val="DefaultParagraphFont"/>
     <w:link w:val="Heading3"/>
     <w:uiPriority w:val="9"/>
+    <w:semiHidden/>
     <w:rsid w:val="00F86118"/>
     <w:rPr>
       <w:rFonts w:eastAsiaTheme="majorEastAsia" w:cstheme="majorBidi"/>

</xml_diff>